<commit_message>
Update investor operations data and UI
</commit_message>
<xml_diff>
--- a/public/investor-downloads/daily-brief-2026-06-01.docx
+++ b/public/investor-downloads/daily-brief-2026-06-01.docx
@@ -8,7 +8,7 @@
       </w:pPr>
       <w:r>
         <w:rPr>
-          <w:rFonts w:ascii="Calibri" w:hAnsi="Calibri" w:eastAsia="Arial Unicode MS"/>
+          <w:rFonts w:ascii="Calibri" w:hAnsi="Calibri" w:eastAsia="Songti SC"/>
           <w:b/>
           <w:i w:val="0"/>
           <w:color w:val="285B9D"/>
@@ -24,7 +24,7 @@
       </w:pPr>
       <w:r>
         <w:rPr>
-          <w:rFonts w:ascii="Calibri" w:hAnsi="Calibri" w:eastAsia="Arial Unicode MS"/>
+          <w:rFonts w:ascii="Calibri" w:hAnsi="Calibri" w:eastAsia="Songti SC"/>
           <w:b w:val="0"/>
           <w:i w:val="0"/>
         </w:rPr>
@@ -38,7 +38,7 @@
       </w:pPr>
       <w:r>
         <w:rPr>
-          <w:rFonts w:ascii="Calibri" w:hAnsi="Calibri" w:eastAsia="Arial Unicode MS"/>
+          <w:rFonts w:ascii="Calibri" w:hAnsi="Calibri" w:eastAsia="Songti SC"/>
           <w:b w:val="0"/>
           <w:i w:val="0"/>
         </w:rPr>
@@ -51,7 +51,7 @@
       </w:pPr>
       <w:r>
         <w:rPr>
-          <w:rFonts w:ascii="Calibri" w:hAnsi="Calibri" w:eastAsia="Arial Unicode MS"/>
+          <w:rFonts w:ascii="Calibri" w:hAnsi="Calibri" w:eastAsia="Songti SC"/>
           <w:b/>
           <w:i w:val="0"/>
           <w:color w:val="0B2545"/>
@@ -66,13 +66,13 @@
       </w:pPr>
       <w:r>
         <w:rPr>
-          <w:rFonts w:ascii="Calibri" w:hAnsi="Calibri" w:eastAsia="Arial Unicode MS"/>
+          <w:rFonts w:ascii="Calibri" w:hAnsi="Calibri" w:eastAsia="Songti SC"/>
           <w:b w:val="0"/>
           <w:i w:val="0"/>
           <w:color w:val="334155"/>
           <w:sz w:val="22"/>
         </w:rPr>
-        <w:t>2026-06-01 共纳入 73 篇中文研究结果，覆盖 4 位活跃分析师和 6 条主要行业链，较 2026-05-31 的主题变化可在右侧动量表中核对。简报优先呈现可被报告链接追溯的结论，而不是孤立摘要。</w:t>
+        <w:t>2026-06-01 共纳入 226 篇中文研究结果，覆盖 23 位活跃分析师和 6 条主要行业链，较 2026-05-31 的主题变化可在右侧动量表中核对。简报优先呈现可被报告链接追溯的结论，而不是孤立摘要。</w:t>
       </w:r>
     </w:p>
     <w:tbl>
@@ -101,7 +101,7 @@
             </w:pPr>
             <w:r>
               <w:rPr>
-                <w:rFonts w:ascii="Calibri" w:hAnsi="Calibri" w:eastAsia="Arial Unicode MS"/>
+                <w:rFonts w:ascii="Calibri" w:hAnsi="Calibri" w:eastAsia="Songti SC"/>
                 <w:b/>
                 <w:color w:val="667085"/>
                 <w:sz w:val="17"/>
@@ -111,12 +111,12 @@
             </w:r>
             <w:r>
               <w:rPr>
-                <w:rFonts w:ascii="Calibri" w:hAnsi="Calibri" w:eastAsia="Arial Unicode MS"/>
+                <w:rFonts w:ascii="Calibri" w:hAnsi="Calibri" w:eastAsia="Songti SC"/>
                 <w:b/>
                 <w:color w:val="285B9D"/>
                 <w:sz w:val="36"/>
               </w:rPr>
-              <w:t>73</w:t>
+              <w:t>226</w:t>
             </w:r>
           </w:p>
         </w:tc>
@@ -132,7 +132,7 @@
             </w:pPr>
             <w:r>
               <w:rPr>
-                <w:rFonts w:ascii="Calibri" w:hAnsi="Calibri" w:eastAsia="Arial Unicode MS"/>
+                <w:rFonts w:ascii="Calibri" w:hAnsi="Calibri" w:eastAsia="Songti SC"/>
                 <w:b/>
                 <w:color w:val="667085"/>
                 <w:sz w:val="17"/>
@@ -142,12 +142,12 @@
             </w:r>
             <w:r>
               <w:rPr>
-                <w:rFonts w:ascii="Calibri" w:hAnsi="Calibri" w:eastAsia="Arial Unicode MS"/>
+                <w:rFonts w:ascii="Calibri" w:hAnsi="Calibri" w:eastAsia="Songti SC"/>
                 <w:b/>
                 <w:color w:val="237A5B"/>
                 <w:sz w:val="36"/>
               </w:rPr>
-              <w:t>4</w:t>
+              <w:t>23</w:t>
             </w:r>
           </w:p>
         </w:tc>
@@ -163,7 +163,7 @@
             </w:pPr>
             <w:r>
               <w:rPr>
-                <w:rFonts w:ascii="Calibri" w:hAnsi="Calibri" w:eastAsia="Arial Unicode MS"/>
+                <w:rFonts w:ascii="Calibri" w:hAnsi="Calibri" w:eastAsia="Songti SC"/>
                 <w:b/>
                 <w:color w:val="667085"/>
                 <w:sz w:val="17"/>
@@ -173,7 +173,7 @@
             </w:r>
             <w:r>
               <w:rPr>
-                <w:rFonts w:ascii="Calibri" w:hAnsi="Calibri" w:eastAsia="Arial Unicode MS"/>
+                <w:rFonts w:ascii="Calibri" w:hAnsi="Calibri" w:eastAsia="Songti SC"/>
                 <w:b/>
                 <w:color w:val="A8731B"/>
                 <w:sz w:val="36"/>
@@ -194,7 +194,7 @@
             </w:pPr>
             <w:r>
               <w:rPr>
-                <w:rFonts w:ascii="Calibri" w:hAnsi="Calibri" w:eastAsia="Arial Unicode MS"/>
+                <w:rFonts w:ascii="Calibri" w:hAnsi="Calibri" w:eastAsia="Songti SC"/>
                 <w:b/>
                 <w:color w:val="667085"/>
                 <w:sz w:val="17"/>
@@ -204,7 +204,7 @@
             </w:r>
             <w:r>
               <w:rPr>
-                <w:rFonts w:ascii="Calibri" w:hAnsi="Calibri" w:eastAsia="Arial Unicode MS"/>
+                <w:rFonts w:ascii="Calibri" w:hAnsi="Calibri" w:eastAsia="Songti SC"/>
                 <w:b/>
                 <w:color w:val="B43D49"/>
                 <w:sz w:val="36"/>
@@ -268,7 +268,7 @@
       </w:pPr>
       <w:r>
         <w:rPr>
-          <w:rFonts w:ascii="Calibri" w:hAnsi="Calibri" w:eastAsia="Arial Unicode MS"/>
+          <w:rFonts w:ascii="Calibri" w:hAnsi="Calibri" w:eastAsia="Songti SC"/>
           <w:b w:val="0"/>
           <w:i/>
           <w:color w:val="667085"/>
@@ -292,7 +292,7 @@
       </w:pPr>
       <w:r>
         <w:rPr>
-          <w:rFonts w:ascii="Calibri" w:hAnsi="Calibri" w:eastAsia="Arial Unicode MS"/>
+          <w:rFonts w:ascii="Calibri" w:hAnsi="Calibri" w:eastAsia="Songti SC"/>
           <w:b/>
           <w:color w:val="285B9D"/>
           <w:sz w:val="21"/>
@@ -304,7 +304,7 @@
           <w:rPr>
             <w:color w:val="285B9D"/>
             <w:u w:val="single"/>
-            <w:rFonts w:eastAsia="Arial Unicode MS" w:ascii="Calibri" w:hAnsi="Calibri"/>
+            <w:rFonts w:eastAsia="Songti SC" w:ascii="Calibri" w:hAnsi="Calibri"/>
           </w:rPr>
           <w:t>研究报告：AI电网中游环节（GOES/变压器）的工业政策与地缘政治风险分析 是今日最高权重结论，核心证据来自 未识别，关联 工业供给瓶颈。</w:t>
         </w:r>
@@ -317,7 +317,7 @@
       </w:pPr>
       <w:r>
         <w:rPr>
-          <w:rFonts w:ascii="Calibri" w:hAnsi="Calibri" w:eastAsia="Arial Unicode MS"/>
+          <w:rFonts w:ascii="Calibri" w:hAnsi="Calibri" w:eastAsia="Songti SC"/>
           <w:b/>
           <w:color w:val="285B9D"/>
           <w:sz w:val="21"/>
@@ -326,11 +326,11 @@
       </w:r>
       <w:r>
         <w:rPr>
-          <w:rFonts w:ascii="Calibri" w:hAnsi="Calibri" w:eastAsia="Arial Unicode MS"/>
+          <w:rFonts w:ascii="Calibri" w:hAnsi="Calibri" w:eastAsia="Songti SC"/>
           <w:color w:val="111827"/>
           <w:sz w:val="21"/>
         </w:rPr>
-        <w:t>AI 今日 降温，当日计数 60，前一日计数 198。</w:t>
+        <w:t>通胀 今日 升温，当日计数 206，前一日计数 181。</w:t>
       </w:r>
     </w:p>
     <w:p>
@@ -340,7 +340,7 @@
       </w:pPr>
       <w:r>
         <w:rPr>
-          <w:rFonts w:ascii="Calibri" w:hAnsi="Calibri" w:eastAsia="Arial Unicode MS"/>
+          <w:rFonts w:ascii="Calibri" w:hAnsi="Calibri" w:eastAsia="Songti SC"/>
           <w:b/>
           <w:color w:val="285B9D"/>
           <w:sz w:val="21"/>
@@ -352,7 +352,7 @@
           <w:rPr>
             <w:color w:val="285B9D"/>
             <w:u w:val="single"/>
-            <w:rFonts w:eastAsia="Arial Unicode MS" w:ascii="Calibri" w:hAnsi="Calibri"/>
+            <w:rFonts w:eastAsia="Songti SC" w:ascii="Calibri" w:hAnsi="Calibri"/>
           </w:rPr>
           <w:t>风险矩阵最需要跟踪的是 电力与电网：算力瓶颈压力测试：电网传输与并网队列的真实时滞。</w:t>
         </w:r>
@@ -365,7 +365,7 @@
       </w:pPr>
       <w:r>
         <w:rPr>
-          <w:rFonts w:ascii="Calibri" w:hAnsi="Calibri" w:eastAsia="Arial Unicode MS"/>
+          <w:rFonts w:ascii="Calibri" w:hAnsi="Calibri" w:eastAsia="Songti SC"/>
           <w:b/>
           <w:color w:val="285B9D"/>
           <w:sz w:val="21"/>
@@ -377,9 +377,9 @@
           <w:rPr>
             <w:color w:val="285B9D"/>
             <w:u w:val="single"/>
-            <w:rFonts w:eastAsia="Arial Unicode MS" w:ascii="Calibri" w:hAnsi="Calibri"/>
+            <w:rFonts w:eastAsia="Songti SC" w:ascii="Calibri" w:hAnsi="Calibri"/>
           </w:rPr>
-          <w:t>AI 基础设施 今日 60 条、近七日 1362 条，风险信号 922 条。</w:t>
+          <w:t>AI 基础设施 今日 188 条、近七日 1496 条，风险信号 1013 条。</w:t>
         </w:r>
       </w:hyperlink>
     </w:p>
@@ -403,7 +403,7 @@
           <w:p>
             <w:r>
               <w:rPr>
-                <w:rFonts w:ascii="Calibri" w:hAnsi="Calibri" w:eastAsia="Arial Unicode MS"/>
+                <w:rFonts w:ascii="Calibri" w:hAnsi="Calibri" w:eastAsia="Songti SC"/>
                 <w:b/>
                 <w:color w:val="7A5A00"/>
                 <w:sz w:val="21"/>
@@ -412,7 +412,7 @@
             </w:r>
             <w:r>
               <w:rPr>
-                <w:rFonts w:ascii="Calibri" w:hAnsi="Calibri" w:eastAsia="Arial Unicode MS"/>
+                <w:rFonts w:ascii="Calibri" w:hAnsi="Calibri" w:eastAsia="Songti SC"/>
                 <w:color w:val="7C2D12"/>
                 <w:sz w:val="21"/>
               </w:rPr>
@@ -483,7 +483,7 @@
       </w:pPr>
       <w:r>
         <w:rPr>
-          <w:rFonts w:ascii="Calibri" w:hAnsi="Calibri" w:eastAsia="Arial Unicode MS"/>
+          <w:rFonts w:ascii="Calibri" w:hAnsi="Calibri" w:eastAsia="Songti SC"/>
           <w:b w:val="0"/>
           <w:i/>
           <w:color w:val="667085"/>
@@ -540,7 +540,7 @@
       </w:pPr>
       <w:r>
         <w:rPr>
-          <w:rFonts w:ascii="Calibri" w:hAnsi="Calibri" w:eastAsia="Arial Unicode MS"/>
+          <w:rFonts w:ascii="Calibri" w:hAnsi="Calibri" w:eastAsia="Songti SC"/>
           <w:b w:val="0"/>
           <w:i/>
           <w:color w:val="667085"/>
@@ -602,7 +602,7 @@
       </w:pPr>
       <w:r>
         <w:rPr>
-          <w:rFonts w:ascii="Calibri" w:hAnsi="Calibri" w:eastAsia="Arial Unicode MS"/>
+          <w:rFonts w:ascii="Calibri" w:hAnsi="Calibri" w:eastAsia="Songti SC"/>
           <w:b w:val="0"/>
           <w:i/>
           <w:color w:val="667085"/>
@@ -664,7 +664,7 @@
       </w:pPr>
       <w:r>
         <w:rPr>
-          <w:rFonts w:ascii="Calibri" w:hAnsi="Calibri" w:eastAsia="Arial Unicode MS"/>
+          <w:rFonts w:ascii="Calibri" w:hAnsi="Calibri" w:eastAsia="Songti SC"/>
           <w:b w:val="0"/>
           <w:i/>
           <w:color w:val="667085"/>
@@ -687,7 +687,7 @@
       </w:pPr>
       <w:r>
         <w:rPr>
-          <w:rFonts w:ascii="Calibri" w:hAnsi="Calibri" w:eastAsia="Arial Unicode MS"/>
+          <w:rFonts w:ascii="Calibri" w:hAnsi="Calibri" w:eastAsia="Songti SC"/>
           <w:b/>
           <w:i w:val="0"/>
           <w:color w:val="0B2545"/>
@@ -702,7 +702,7 @@
       </w:pPr>
       <w:r>
         <w:rPr>
-          <w:rFonts w:ascii="Calibri" w:hAnsi="Calibri" w:eastAsia="Arial Unicode MS"/>
+          <w:rFonts w:ascii="Calibri" w:hAnsi="Calibri" w:eastAsia="Songti SC"/>
           <w:b w:val="0"/>
           <w:i w:val="0"/>
           <w:color w:val="667085"/>
@@ -717,7 +717,7 @@
       </w:pPr>
       <w:r>
         <w:rPr>
-          <w:rFonts w:ascii="Calibri" w:hAnsi="Calibri" w:eastAsia="Arial Unicode MS"/>
+          <w:rFonts w:ascii="Calibri" w:hAnsi="Calibri" w:eastAsia="Songti SC"/>
           <w:b w:val="0"/>
           <w:i w:val="0"/>
           <w:color w:val="334155"/>
@@ -732,7 +732,7 @@
       </w:pPr>
       <w:r>
         <w:rPr>
-          <w:rFonts w:ascii="Calibri" w:hAnsi="Calibri" w:eastAsia="Arial Unicode MS"/>
+          <w:rFonts w:ascii="Calibri" w:hAnsi="Calibri" w:eastAsia="Songti SC"/>
           <w:b w:val="0"/>
           <w:i w:val="0"/>
           <w:color w:val="667085"/>
@@ -745,7 +745,7 @@
           <w:rPr>
             <w:color w:val="285B9D"/>
             <w:u w:val="single"/>
-            <w:rFonts w:eastAsia="Arial Unicode MS" w:ascii="Calibri" w:hAnsi="Calibri"/>
+            <w:rFonts w:eastAsia="Songti SC" w:ascii="Calibri" w:hAnsi="Calibri"/>
           </w:rPr>
           <w:t>reports/archive-b5b0ba20bad0</w:t>
         </w:r>
@@ -757,13 +757,13 @@
       </w:pPr>
       <w:r>
         <w:rPr>
-          <w:rFonts w:ascii="Calibri" w:hAnsi="Calibri" w:eastAsia="Arial Unicode MS"/>
+          <w:rFonts w:ascii="Calibri" w:hAnsi="Calibri" w:eastAsia="Songti SC"/>
           <w:b/>
           <w:i w:val="0"/>
           <w:color w:val="0B2545"/>
           <w:sz w:val="23"/>
         </w:rPr>
-        <w:t>2. "算电协同"下电力与电网设备：CAPEX 脉冲与周期定位</w:t>
+        <w:t>2. 核心观点</w:t>
       </w:r>
     </w:p>
     <w:p>
@@ -772,7 +772,77 @@
       </w:pPr>
       <w:r>
         <w:rPr>
-          <w:rFonts w:ascii="Calibri" w:hAnsi="Calibri" w:eastAsia="Arial Unicode MS"/>
+          <w:rFonts w:ascii="Calibri" w:hAnsi="Calibri" w:eastAsia="Songti SC"/>
+          <w:b w:val="0"/>
+          <w:i w:val="0"/>
+          <w:color w:val="667085"/>
+          <w:sz w:val="17"/>
+        </w:rPr>
+        <w:t>未识别 · AI 基础设施 · score 51.0</w:t>
+      </w:r>
+    </w:p>
+    <w:p>
+      <w:pPr>
+        <w:spacing w:before="0" w:after="100" w:line="264" w:lineRule="auto"/>
+      </w:pPr>
+      <w:r>
+        <w:rPr>
+          <w:rFonts w:ascii="Calibri" w:hAnsi="Calibri" w:eastAsia="Songti SC"/>
+          <w:b w:val="0"/>
+          <w:i w:val="0"/>
+          <w:color w:val="334155"/>
+          <w:sz w:val="20"/>
+        </w:rPr>
+        <w:t>title: "算力高密化与电网瓶颈下的配电设备及温控资本开支压测" date: "2026-06-01" author: "工业制造分析师" stance: "support"</w:t>
+      </w:r>
+    </w:p>
+    <w:p>
+      <w:pPr>
+        <w:spacing w:before="0" w:after="160" w:line="264" w:lineRule="auto"/>
+      </w:pPr>
+      <w:r>
+        <w:rPr>
+          <w:rFonts w:ascii="Calibri" w:hAnsi="Calibri" w:eastAsia="Songti SC"/>
+          <w:b w:val="0"/>
+          <w:i w:val="0"/>
+          <w:color w:val="667085"/>
+          <w:sz w:val="17"/>
+        </w:rPr>
+        <w:t xml:space="preserve">Report: </w:t>
+      </w:r>
+      <w:hyperlink r:id="rId19">
+        <w:r>
+          <w:rPr>
+            <w:color w:val="285B9D"/>
+            <w:u w:val="single"/>
+            <w:rFonts w:eastAsia="Songti SC" w:ascii="Calibri" w:hAnsi="Calibri"/>
+          </w:rPr>
+          <w:t>reports/archive-0939f0b7cabf</w:t>
+        </w:r>
+      </w:hyperlink>
+    </w:p>
+    <w:p>
+      <w:pPr>
+        <w:spacing w:before="0" w:after="40" w:line="264" w:lineRule="auto"/>
+      </w:pPr>
+      <w:r>
+        <w:rPr>
+          <w:rFonts w:ascii="Calibri" w:hAnsi="Calibri" w:eastAsia="Songti SC"/>
+          <w:b/>
+          <w:i w:val="0"/>
+          <w:color w:val="0B2545"/>
+          <w:sz w:val="23"/>
+        </w:rPr>
+        <w:t>3. "算电协同"下电力与电网设备：CAPEX 脉冲与周期定位</w:t>
+      </w:r>
+    </w:p>
+    <w:p>
+      <w:pPr>
+        <w:spacing w:before="0" w:after="40" w:line="264" w:lineRule="auto"/>
+      </w:pPr>
+      <w:r>
+        <w:rPr>
+          <w:rFonts w:ascii="Calibri" w:hAnsi="Calibri" w:eastAsia="Songti SC"/>
           <w:b w:val="0"/>
           <w:i w:val="0"/>
           <w:color w:val="667085"/>
@@ -787,7 +857,7 @@
       </w:pPr>
       <w:r>
         <w:rPr>
-          <w:rFonts w:ascii="Calibri" w:hAnsi="Calibri" w:eastAsia="Arial Unicode MS"/>
+          <w:rFonts w:ascii="Calibri" w:hAnsi="Calibri" w:eastAsia="Songti SC"/>
           <w:b w:val="0"/>
           <w:i w:val="0"/>
           <w:color w:val="334155"/>
@@ -802,7 +872,7 @@
       </w:pPr>
       <w:r>
         <w:rPr>
-          <w:rFonts w:ascii="Calibri" w:hAnsi="Calibri" w:eastAsia="Arial Unicode MS"/>
+          <w:rFonts w:ascii="Calibri" w:hAnsi="Calibri" w:eastAsia="Songti SC"/>
           <w:b w:val="0"/>
           <w:i w:val="0"/>
           <w:color w:val="667085"/>
@@ -810,12 +880,12 @@
         </w:rPr>
         <w:t xml:space="preserve">Report: </w:t>
       </w:r>
-      <w:hyperlink r:id="rId19">
+      <w:hyperlink r:id="rId20">
         <w:r>
           <w:rPr>
             <w:color w:val="285B9D"/>
             <w:u w:val="single"/>
-            <w:rFonts w:eastAsia="Arial Unicode MS" w:ascii="Calibri" w:hAnsi="Calibri"/>
+            <w:rFonts w:eastAsia="Songti SC" w:ascii="Calibri" w:hAnsi="Calibri"/>
           </w:rPr>
           <w:t>reports/archive-06778d37ded7</w:t>
         </w:r>
@@ -827,13 +897,13 @@
       </w:pPr>
       <w:r>
         <w:rPr>
-          <w:rFonts w:ascii="Calibri" w:hAnsi="Calibri" w:eastAsia="Arial Unicode MS"/>
+          <w:rFonts w:ascii="Calibri" w:hAnsi="Calibri" w:eastAsia="Songti SC"/>
           <w:b/>
           <w:i w:val="0"/>
           <w:color w:val="0B2545"/>
           <w:sz w:val="23"/>
         </w:rPr>
-        <w:t>3. AI 数据中心电力成本：对西部绿电迁移叙事的压力测试及对算力贝塔毛利率的侵蚀</w:t>
+        <w:t>4. 算力国产化闭环中的能源约束：电力供应与电网调峰压力分析</w:t>
       </w:r>
     </w:p>
     <w:p>
@@ -842,7 +912,77 @@
       </w:pPr>
       <w:r>
         <w:rPr>
-          <w:rFonts w:ascii="Calibri" w:hAnsi="Calibri" w:eastAsia="Arial Unicode MS"/>
+          <w:rFonts w:ascii="Calibri" w:hAnsi="Calibri" w:eastAsia="Songti SC"/>
+          <w:b w:val="0"/>
+          <w:i w:val="0"/>
+          <w:color w:val="667085"/>
+          <w:sz w:val="17"/>
+        </w:rPr>
+        <w:t>未识别 · AI 基础设施 · score 49.6</w:t>
+      </w:r>
+    </w:p>
+    <w:p>
+      <w:pPr>
+        <w:spacing w:before="0" w:after="100" w:line="264" w:lineRule="auto"/>
+      </w:pPr>
+      <w:r>
+        <w:rPr>
+          <w:rFonts w:ascii="Calibri" w:hAnsi="Calibri" w:eastAsia="Songti SC"/>
+          <w:b w:val="0"/>
+          <w:i w:val="0"/>
+          <w:color w:val="334155"/>
+          <w:sz w:val="20"/>
+        </w:rPr>
+        <w:t>工作日期: 2026-06-01 分析师: energy-analyst 当前立场: 压力测试 (stress-test)</w:t>
+      </w:r>
+    </w:p>
+    <w:p>
+      <w:pPr>
+        <w:spacing w:before="0" w:after="160" w:line="264" w:lineRule="auto"/>
+      </w:pPr>
+      <w:r>
+        <w:rPr>
+          <w:rFonts w:ascii="Calibri" w:hAnsi="Calibri" w:eastAsia="Songti SC"/>
+          <w:b w:val="0"/>
+          <w:i w:val="0"/>
+          <w:color w:val="667085"/>
+          <w:sz w:val="17"/>
+        </w:rPr>
+        <w:t xml:space="preserve">Report: </w:t>
+      </w:r>
+      <w:hyperlink r:id="rId21">
+        <w:r>
+          <w:rPr>
+            <w:color w:val="285B9D"/>
+            <w:u w:val="single"/>
+            <w:rFonts w:eastAsia="Songti SC" w:ascii="Calibri" w:hAnsi="Calibri"/>
+          </w:rPr>
+          <w:t>reports/archive-90363200b5cb</w:t>
+        </w:r>
+      </w:hyperlink>
+    </w:p>
+    <w:p>
+      <w:pPr>
+        <w:spacing w:before="0" w:after="40" w:line="264" w:lineRule="auto"/>
+      </w:pPr>
+      <w:r>
+        <w:rPr>
+          <w:rFonts w:ascii="Calibri" w:hAnsi="Calibri" w:eastAsia="Songti SC"/>
+          <w:b/>
+          <w:i w:val="0"/>
+          <w:color w:val="0B2545"/>
+          <w:sz w:val="23"/>
+        </w:rPr>
+        <w:t>5. AI 数据中心电力成本：对西部绿电迁移叙事的压力测试及对算力贝塔毛利率的侵蚀</w:t>
+      </w:r>
+    </w:p>
+    <w:p>
+      <w:pPr>
+        <w:spacing w:before="0" w:after="40" w:line="264" w:lineRule="auto"/>
+      </w:pPr>
+      <w:r>
+        <w:rPr>
+          <w:rFonts w:ascii="Calibri" w:hAnsi="Calibri" w:eastAsia="Songti SC"/>
           <w:b w:val="0"/>
           <w:i w:val="0"/>
           <w:color w:val="667085"/>
@@ -857,7 +997,7 @@
       </w:pPr>
       <w:r>
         <w:rPr>
-          <w:rFonts w:ascii="Calibri" w:hAnsi="Calibri" w:eastAsia="Arial Unicode MS"/>
+          <w:rFonts w:ascii="Calibri" w:hAnsi="Calibri" w:eastAsia="Songti SC"/>
           <w:b w:val="0"/>
           <w:i w:val="0"/>
           <w:color w:val="334155"/>
@@ -872,7 +1012,7 @@
       </w:pPr>
       <w:r>
         <w:rPr>
-          <w:rFonts w:ascii="Calibri" w:hAnsi="Calibri" w:eastAsia="Arial Unicode MS"/>
+          <w:rFonts w:ascii="Calibri" w:hAnsi="Calibri" w:eastAsia="Songti SC"/>
           <w:b w:val="0"/>
           <w:i w:val="0"/>
           <w:color w:val="667085"/>
@@ -880,12 +1020,12 @@
         </w:rPr>
         <w:t xml:space="preserve">Report: </w:t>
       </w:r>
-      <w:hyperlink r:id="rId20">
+      <w:hyperlink r:id="rId22">
         <w:r>
           <w:rPr>
             <w:color w:val="285B9D"/>
             <w:u w:val="single"/>
-            <w:rFonts w:eastAsia="Arial Unicode MS" w:ascii="Calibri" w:hAnsi="Calibri"/>
+            <w:rFonts w:eastAsia="Songti SC" w:ascii="Calibri" w:hAnsi="Calibri"/>
           </w:rPr>
           <w:t>reports/archive-b8ed0ee6dae7</w:t>
         </w:r>
@@ -897,13 +1037,13 @@
       </w:pPr>
       <w:r>
         <w:rPr>
-          <w:rFonts w:ascii="Calibri" w:hAnsi="Calibri" w:eastAsia="Arial Unicode MS"/>
+          <w:rFonts w:ascii="Calibri" w:hAnsi="Calibri" w:eastAsia="Songti SC"/>
           <w:b/>
           <w:i w:val="0"/>
           <w:color w:val="0B2545"/>
           <w:sz w:val="23"/>
         </w:rPr>
-        <w:t>4. 2026-06-01 风险报告：AI电网设备脱钩与TMT估值压力测试</w:t>
+        <w:t>6. 2026-06-01 风险报告：AI电网设备脱钩与TMT估值压力测试</w:t>
       </w:r>
     </w:p>
     <w:p>
@@ -912,7 +1052,7 @@
       </w:pPr>
       <w:r>
         <w:rPr>
-          <w:rFonts w:ascii="Calibri" w:hAnsi="Calibri" w:eastAsia="Arial Unicode MS"/>
+          <w:rFonts w:ascii="Calibri" w:hAnsi="Calibri" w:eastAsia="Songti SC"/>
           <w:b w:val="0"/>
           <w:i w:val="0"/>
           <w:color w:val="667085"/>
@@ -927,7 +1067,7 @@
       </w:pPr>
       <w:r>
         <w:rPr>
-          <w:rFonts w:ascii="Calibri" w:hAnsi="Calibri" w:eastAsia="Arial Unicode MS"/>
+          <w:rFonts w:ascii="Calibri" w:hAnsi="Calibri" w:eastAsia="Songti SC"/>
           <w:b w:val="0"/>
           <w:i w:val="0"/>
           <w:color w:val="334155"/>
@@ -942,147 +1082,7 @@
       </w:pPr>
       <w:r>
         <w:rPr>
-          <w:rFonts w:ascii="Calibri" w:hAnsi="Calibri" w:eastAsia="Arial Unicode MS"/>
-          <w:b w:val="0"/>
-          <w:i w:val="0"/>
-          <w:color w:val="667085"/>
-          <w:sz w:val="17"/>
-        </w:rPr>
-        <w:t xml:space="preserve">Report: </w:t>
-      </w:r>
-      <w:hyperlink r:id="rId21">
-        <w:r>
-          <w:rPr>
-            <w:color w:val="285B9D"/>
-            <w:u w:val="single"/>
-            <w:rFonts w:eastAsia="Arial Unicode MS" w:ascii="Calibri" w:hAnsi="Calibri"/>
-          </w:rPr>
-          <w:t>reports/archive-761c20d44e35</w:t>
-        </w:r>
-      </w:hyperlink>
-    </w:p>
-    <w:p>
-      <w:pPr>
-        <w:spacing w:before="0" w:after="40" w:line="264" w:lineRule="auto"/>
-      </w:pPr>
-      <w:r>
-        <w:rPr>
-          <w:rFonts w:ascii="Calibri" w:hAnsi="Calibri" w:eastAsia="Arial Unicode MS"/>
-          <w:b/>
-          <w:i w:val="0"/>
-          <w:color w:val="0B2545"/>
-          <w:sz w:val="23"/>
-        </w:rPr>
-        <w:t>5. 半导体设备与AI硬件产业链的自主化韧性及出口管制风险：高端制造缓冲的“应力测试”与三大裂纹</w:t>
-      </w:r>
-    </w:p>
-    <w:p>
-      <w:pPr>
-        <w:spacing w:before="0" w:after="40" w:line="264" w:lineRule="auto"/>
-      </w:pPr>
-      <w:r>
-        <w:rPr>
-          <w:rFonts w:ascii="Calibri" w:hAnsi="Calibri" w:eastAsia="Arial Unicode MS"/>
-          <w:b w:val="0"/>
-          <w:i w:val="0"/>
-          <w:color w:val="667085"/>
-          <w:sz w:val="17"/>
-        </w:rPr>
-        <w:t>未识别 · 宏观通胀传导 · score 47.2</w:t>
-      </w:r>
-    </w:p>
-    <w:p>
-      <w:pPr>
-        <w:spacing w:before="0" w:after="100" w:line="264" w:lineRule="auto"/>
-      </w:pPr>
-      <w:r>
-        <w:rPr>
-          <w:rFonts w:ascii="Calibri" w:hAnsi="Calibri" w:eastAsia="Arial Unicode MS"/>
-          <w:b w:val="0"/>
-          <w:i w:val="0"/>
-          <w:color w:val="334155"/>
-          <w:sz w:val="20"/>
-        </w:rPr>
-        <w:t>半导体设备与AI硬件产业链的自主化韧性及出口管制风险：高端制造缓冲的“应力测试”与三大裂纹 报告日期 : 2026-06-01 分析师 : agy (TMT行业分析师) 本报告定位 : 压力测试 (Stress-Test) / 部...</w:t>
-      </w:r>
-    </w:p>
-    <w:p>
-      <w:pPr>
-        <w:spacing w:before="0" w:after="160" w:line="264" w:lineRule="auto"/>
-      </w:pPr>
-      <w:r>
-        <w:rPr>
-          <w:rFonts w:ascii="Calibri" w:hAnsi="Calibri" w:eastAsia="Arial Unicode MS"/>
-          <w:b w:val="0"/>
-          <w:i w:val="0"/>
-          <w:color w:val="667085"/>
-          <w:sz w:val="17"/>
-        </w:rPr>
-        <w:t xml:space="preserve">Report: </w:t>
-      </w:r>
-      <w:hyperlink r:id="rId22">
-        <w:r>
-          <w:rPr>
-            <w:color w:val="285B9D"/>
-            <w:u w:val="single"/>
-            <w:rFonts w:eastAsia="Arial Unicode MS" w:ascii="Calibri" w:hAnsi="Calibri"/>
-          </w:rPr>
-          <w:t>reports/archive-f0ab6e35f444</w:t>
-        </w:r>
-      </w:hyperlink>
-    </w:p>
-    <w:p>
-      <w:pPr>
-        <w:spacing w:before="0" w:after="40" w:line="264" w:lineRule="auto"/>
-      </w:pPr>
-      <w:r>
-        <w:rPr>
-          <w:rFonts w:ascii="Calibri" w:hAnsi="Calibri" w:eastAsia="Arial Unicode MS"/>
-          <w:b/>
-          <w:i w:val="0"/>
-          <w:color w:val="0B2545"/>
-          <w:sz w:val="23"/>
-        </w:rPr>
-        <w:t>6. 2026-06-01 电网瓶颈：公用事业成为 AI 电力落地的收费闸门</w:t>
-      </w:r>
-    </w:p>
-    <w:p>
-      <w:pPr>
-        <w:spacing w:before="0" w:after="40" w:line="264" w:lineRule="auto"/>
-      </w:pPr>
-      <w:r>
-        <w:rPr>
-          <w:rFonts w:ascii="Calibri" w:hAnsi="Calibri" w:eastAsia="Arial Unicode MS"/>
-          <w:b w:val="0"/>
-          <w:i w:val="0"/>
-          <w:color w:val="667085"/>
-          <w:sz w:val="17"/>
-        </w:rPr>
-        <w:t>未识别 · 电力与电网 · score 46.5</w:t>
-      </w:r>
-    </w:p>
-    <w:p>
-      <w:pPr>
-        <w:spacing w:before="0" w:after="100" w:line="264" w:lineRule="auto"/>
-      </w:pPr>
-      <w:r>
-        <w:rPr>
-          <w:rFonts w:ascii="Calibri" w:hAnsi="Calibri" w:eastAsia="Arial Unicode MS"/>
-          <w:b w:val="0"/>
-          <w:i w:val="0"/>
-          <w:color w:val="334155"/>
-          <w:sz w:val="20"/>
-        </w:rPr>
-        <w:t>日期： 2026-06-01 分析师： codex（公用事业分析师） Board ID： 08da7f87-5408-464b-a324-17059c484493 研究记录 立场： support</w:t>
-      </w:r>
-    </w:p>
-    <w:p>
-      <w:pPr>
-        <w:spacing w:before="0" w:after="160" w:line="264" w:lineRule="auto"/>
-      </w:pPr>
-      <w:r>
-        <w:rPr>
-          <w:rFonts w:ascii="Calibri" w:hAnsi="Calibri" w:eastAsia="Arial Unicode MS"/>
+          <w:rFonts w:ascii="Calibri" w:hAnsi="Calibri" w:eastAsia="Songti SC"/>
           <w:b w:val="0"/>
           <w:i w:val="0"/>
           <w:color w:val="667085"/>
@@ -1095,9 +1095,9 @@
           <w:rPr>
             <w:color w:val="285B9D"/>
             <w:u w:val="single"/>
-            <w:rFonts w:eastAsia="Arial Unicode MS" w:ascii="Calibri" w:hAnsi="Calibri"/>
+            <w:rFonts w:eastAsia="Songti SC" w:ascii="Calibri" w:hAnsi="Calibri"/>
           </w:rPr>
-          <w:t>reports/archive-23d13a6ba04b</w:t>
+          <w:t>reports/archive-761c20d44e35</w:t>
         </w:r>
       </w:hyperlink>
     </w:p>
@@ -1115,7 +1115,7 @@
       </w:pPr>
       <w:r>
         <w:rPr>
-          <w:rFonts w:ascii="Calibri" w:hAnsi="Calibri" w:eastAsia="Arial Unicode MS"/>
+          <w:rFonts w:ascii="Calibri" w:hAnsi="Calibri" w:eastAsia="Songti SC"/>
           <w:b/>
           <w:i w:val="0"/>
           <w:color w:val="0B2545"/>
@@ -1130,7 +1130,7 @@
       </w:pPr>
       <w:r>
         <w:rPr>
-          <w:rFonts w:ascii="Calibri" w:hAnsi="Calibri" w:eastAsia="Arial Unicode MS"/>
+          <w:rFonts w:ascii="Calibri" w:hAnsi="Calibri" w:eastAsia="Songti SC"/>
           <w:b w:val="0"/>
           <w:i w:val="0"/>
           <w:color w:val="334155"/>
@@ -1145,7 +1145,7 @@
       </w:pPr>
       <w:r>
         <w:rPr>
-          <w:rFonts w:ascii="Calibri" w:hAnsi="Calibri" w:eastAsia="Arial Unicode MS"/>
+          <w:rFonts w:ascii="Calibri" w:hAnsi="Calibri" w:eastAsia="Songti SC"/>
           <w:b w:val="0"/>
           <w:i w:val="0"/>
           <w:color w:val="667085"/>
@@ -1158,7 +1158,7 @@
           <w:rPr>
             <w:color w:val="285B9D"/>
             <w:u w:val="single"/>
-            <w:rFonts w:eastAsia="Arial Unicode MS" w:ascii="Calibri" w:hAnsi="Calibri"/>
+            <w:rFonts w:eastAsia="Songti SC" w:ascii="Calibri" w:hAnsi="Calibri"/>
           </w:rPr>
           <w:t>reports/archive-5166d41eec14</w:t>
         </w:r>
@@ -1170,7 +1170,7 @@
       </w:pPr>
       <w:r>
         <w:rPr>
-          <w:rFonts w:ascii="Calibri" w:hAnsi="Calibri" w:eastAsia="Arial Unicode MS"/>
+          <w:rFonts w:ascii="Calibri" w:hAnsi="Calibri" w:eastAsia="Songti SC"/>
           <w:b/>
           <w:i w:val="0"/>
           <w:color w:val="0B2545"/>
@@ -1185,7 +1185,7 @@
       </w:pPr>
       <w:r>
         <w:rPr>
-          <w:rFonts w:ascii="Calibri" w:hAnsi="Calibri" w:eastAsia="Arial Unicode MS"/>
+          <w:rFonts w:ascii="Calibri" w:hAnsi="Calibri" w:eastAsia="Songti SC"/>
           <w:b w:val="0"/>
           <w:i w:val="0"/>
           <w:color w:val="334155"/>
@@ -1200,7 +1200,7 @@
       </w:pPr>
       <w:r>
         <w:rPr>
-          <w:rFonts w:ascii="Calibri" w:hAnsi="Calibri" w:eastAsia="Arial Unicode MS"/>
+          <w:rFonts w:ascii="Calibri" w:hAnsi="Calibri" w:eastAsia="Songti SC"/>
           <w:b w:val="0"/>
           <w:i w:val="0"/>
           <w:color w:val="667085"/>
@@ -1213,7 +1213,7 @@
           <w:rPr>
             <w:color w:val="285B9D"/>
             <w:u w:val="single"/>
-            <w:rFonts w:eastAsia="Arial Unicode MS" w:ascii="Calibri" w:hAnsi="Calibri"/>
+            <w:rFonts w:eastAsia="Songti SC" w:ascii="Calibri" w:hAnsi="Calibri"/>
           </w:rPr>
           <w:t>reports/archive-19bf4c5712c0</w:t>
         </w:r>
@@ -1225,7 +1225,7 @@
       </w:pPr>
       <w:r>
         <w:rPr>
-          <w:rFonts w:ascii="Calibri" w:hAnsi="Calibri" w:eastAsia="Arial Unicode MS"/>
+          <w:rFonts w:ascii="Calibri" w:hAnsi="Calibri" w:eastAsia="Songti SC"/>
           <w:b/>
           <w:i w:val="0"/>
           <w:color w:val="0B2545"/>
@@ -1240,7 +1240,7 @@
       </w:pPr>
       <w:r>
         <w:rPr>
-          <w:rFonts w:ascii="Calibri" w:hAnsi="Calibri" w:eastAsia="Arial Unicode MS"/>
+          <w:rFonts w:ascii="Calibri" w:hAnsi="Calibri" w:eastAsia="Songti SC"/>
           <w:b w:val="0"/>
           <w:i w:val="0"/>
           <w:color w:val="334155"/>
@@ -1255,7 +1255,7 @@
       </w:pPr>
       <w:r>
         <w:rPr>
-          <w:rFonts w:ascii="Calibri" w:hAnsi="Calibri" w:eastAsia="Arial Unicode MS"/>
+          <w:rFonts w:ascii="Calibri" w:hAnsi="Calibri" w:eastAsia="Songti SC"/>
           <w:b w:val="0"/>
           <w:i w:val="0"/>
           <w:color w:val="667085"/>
@@ -1268,7 +1268,7 @@
           <w:rPr>
             <w:color w:val="285B9D"/>
             <w:u w:val="single"/>
-            <w:rFonts w:eastAsia="Arial Unicode MS" w:ascii="Calibri" w:hAnsi="Calibri"/>
+            <w:rFonts w:eastAsia="Songti SC" w:ascii="Calibri" w:hAnsi="Calibri"/>
           </w:rPr>
           <w:t>reports/archive-393766a70997</w:t>
         </w:r>
@@ -1311,7 +1311,7 @@
             <w:r/>
             <w:r>
               <w:rPr>
-                <w:rFonts w:ascii="Calibri" w:hAnsi="Calibri" w:eastAsia="Arial Unicode MS"/>
+                <w:rFonts w:ascii="Calibri" w:hAnsi="Calibri" w:eastAsia="Songti SC"/>
                 <w:b/>
                 <w:color w:val="475569"/>
                 <w:sz w:val="18"/>
@@ -1334,7 +1334,7 @@
             <w:r/>
             <w:r>
               <w:rPr>
-                <w:rFonts w:ascii="Calibri" w:hAnsi="Calibri" w:eastAsia="Arial Unicode MS"/>
+                <w:rFonts w:ascii="Calibri" w:hAnsi="Calibri" w:eastAsia="Songti SC"/>
                 <w:b/>
                 <w:color w:val="475569"/>
                 <w:sz w:val="18"/>
@@ -1357,7 +1357,7 @@
             <w:r/>
             <w:r>
               <w:rPr>
-                <w:rFonts w:ascii="Calibri" w:hAnsi="Calibri" w:eastAsia="Arial Unicode MS"/>
+                <w:rFonts w:ascii="Calibri" w:hAnsi="Calibri" w:eastAsia="Songti SC"/>
                 <w:b/>
                 <w:color w:val="475569"/>
                 <w:sz w:val="18"/>
@@ -1380,7 +1380,7 @@
             <w:r/>
             <w:r>
               <w:rPr>
-                <w:rFonts w:ascii="Calibri" w:hAnsi="Calibri" w:eastAsia="Arial Unicode MS"/>
+                <w:rFonts w:ascii="Calibri" w:hAnsi="Calibri" w:eastAsia="Songti SC"/>
                 <w:b/>
                 <w:color w:val="475569"/>
                 <w:sz w:val="18"/>
@@ -1403,7 +1403,7 @@
             <w:r/>
             <w:r>
               <w:rPr>
-                <w:rFonts w:ascii="Calibri" w:hAnsi="Calibri" w:eastAsia="Arial Unicode MS"/>
+                <w:rFonts w:ascii="Calibri" w:hAnsi="Calibri" w:eastAsia="Songti SC"/>
                 <w:b/>
                 <w:color w:val="475569"/>
                 <w:sz w:val="18"/>
@@ -1426,7 +1426,7 @@
             <w:r/>
             <w:r>
               <w:rPr>
-                <w:rFonts w:ascii="Calibri" w:hAnsi="Calibri" w:eastAsia="Arial Unicode MS"/>
+                <w:rFonts w:ascii="Calibri" w:hAnsi="Calibri" w:eastAsia="Songti SC"/>
                 <w:b w:val="0"/>
                 <w:color w:val="111827"/>
                 <w:sz w:val="17"/>
@@ -1447,7 +1447,7 @@
             <w:r/>
             <w:r>
               <w:rPr>
-                <w:rFonts w:ascii="Calibri" w:hAnsi="Calibri" w:eastAsia="Arial Unicode MS"/>
+                <w:rFonts w:ascii="Calibri" w:hAnsi="Calibri" w:eastAsia="Songti SC"/>
                 <w:b w:val="0"/>
                 <w:color w:val="111827"/>
                 <w:sz w:val="16"/>
@@ -1468,7 +1468,7 @@
             <w:r/>
             <w:r>
               <w:rPr>
-                <w:rFonts w:ascii="Calibri" w:hAnsi="Calibri" w:eastAsia="Arial Unicode MS"/>
+                <w:rFonts w:ascii="Calibri" w:hAnsi="Calibri" w:eastAsia="Songti SC"/>
                 <w:b w:val="0"/>
                 <w:color w:val="111827"/>
                 <w:sz w:val="16"/>
@@ -1490,7 +1490,7 @@
             <w:r/>
             <w:r>
               <w:rPr>
-                <w:rFonts w:ascii="Calibri" w:hAnsi="Calibri" w:eastAsia="Arial Unicode MS"/>
+                <w:rFonts w:ascii="Calibri" w:hAnsi="Calibri" w:eastAsia="Songti SC"/>
                 <w:b/>
                 <w:color w:val="111827"/>
                 <w:sz w:val="17"/>
@@ -1512,7 +1512,7 @@
             <w:r/>
             <w:r>
               <w:rPr>
-                <w:rFonts w:ascii="Calibri" w:hAnsi="Calibri" w:eastAsia="Arial Unicode MS"/>
+                <w:rFonts w:ascii="Calibri" w:hAnsi="Calibri" w:eastAsia="Songti SC"/>
                 <w:b w:val="0"/>
                 <w:color w:val="111827"/>
                 <w:sz w:val="16"/>
@@ -1535,12 +1535,12 @@
             <w:r/>
             <w:r>
               <w:rPr>
-                <w:rFonts w:ascii="Calibri" w:hAnsi="Calibri" w:eastAsia="Arial Unicode MS"/>
+                <w:rFonts w:ascii="Calibri" w:hAnsi="Calibri" w:eastAsia="Songti SC"/>
                 <w:b w:val="0"/>
                 <w:color w:val="111827"/>
                 <w:sz w:val="17"/>
               </w:rPr>
-              <w:t>"算电协同"下电力与电网设备：CAPEX 脉冲与周期定位</w:t>
+              <w:t>核心观点</w:t>
             </w:r>
           </w:p>
         </w:tc>
@@ -1556,7 +1556,7 @@
             <w:r/>
             <w:r>
               <w:rPr>
-                <w:rFonts w:ascii="Calibri" w:hAnsi="Calibri" w:eastAsia="Arial Unicode MS"/>
+                <w:rFonts w:ascii="Calibri" w:hAnsi="Calibri" w:eastAsia="Songti SC"/>
                 <w:b w:val="0"/>
                 <w:color w:val="111827"/>
                 <w:sz w:val="16"/>
@@ -1577,7 +1577,7 @@
             <w:r/>
             <w:r>
               <w:rPr>
-                <w:rFonts w:ascii="Calibri" w:hAnsi="Calibri" w:eastAsia="Arial Unicode MS"/>
+                <w:rFonts w:ascii="Calibri" w:hAnsi="Calibri" w:eastAsia="Songti SC"/>
                 <w:b w:val="0"/>
                 <w:color w:val="111827"/>
                 <w:sz w:val="16"/>
@@ -1599,7 +1599,116 @@
             <w:r/>
             <w:r>
               <w:rPr>
-                <w:rFonts w:ascii="Calibri" w:hAnsi="Calibri" w:eastAsia="Arial Unicode MS"/>
+                <w:rFonts w:ascii="Calibri" w:hAnsi="Calibri" w:eastAsia="Songti SC"/>
+                <w:b/>
+                <w:color w:val="111827"/>
+                <w:sz w:val="17"/>
+              </w:rPr>
+              <w:t>51.0</w:t>
+            </w:r>
+          </w:p>
+        </w:tc>
+        <w:tc>
+          <w:tcPr>
+            <w:tcW w:type="dxa" w:w="1500"/>
+            <w:vAlign w:val="center"/>
+          </w:tcPr>
+          <w:p>
+            <w:pPr>
+              <w:spacing w:before="0" w:after="0"/>
+              <w:jc w:val="center"/>
+            </w:pPr>
+            <w:r/>
+            <w:r>
+              <w:rPr>
+                <w:rFonts w:ascii="Calibri" w:hAnsi="Calibri" w:eastAsia="Songti SC"/>
+                <w:b w:val="0"/>
+                <w:color w:val="111827"/>
+                <w:sz w:val="16"/>
+              </w:rPr>
+              <w:t>风险 2</w:t>
+            </w:r>
+          </w:p>
+        </w:tc>
+      </w:tr>
+      <w:tr>
+        <w:tc>
+          <w:tcPr>
+            <w:tcW w:type="dxa" w:w="3720"/>
+            <w:vAlign w:val="center"/>
+          </w:tcPr>
+          <w:p>
+            <w:pPr>
+              <w:spacing w:before="0" w:after="0"/>
+            </w:pPr>
+            <w:r/>
+            <w:r>
+              <w:rPr>
+                <w:rFonts w:ascii="Calibri" w:hAnsi="Calibri" w:eastAsia="Songti SC"/>
+                <w:b w:val="0"/>
+                <w:color w:val="111827"/>
+                <w:sz w:val="17"/>
+              </w:rPr>
+              <w:t>"算电协同"下电力与电网设备：CAPEX 脉冲与周期定位</w:t>
+            </w:r>
+          </w:p>
+        </w:tc>
+        <w:tc>
+          <w:tcPr>
+            <w:tcW w:type="dxa" w:w="1560"/>
+            <w:vAlign w:val="center"/>
+          </w:tcPr>
+          <w:p>
+            <w:pPr>
+              <w:spacing w:before="0" w:after="0"/>
+            </w:pPr>
+            <w:r/>
+            <w:r>
+              <w:rPr>
+                <w:rFonts w:ascii="Calibri" w:hAnsi="Calibri" w:eastAsia="Songti SC"/>
+                <w:b w:val="0"/>
+                <w:color w:val="111827"/>
+                <w:sz w:val="16"/>
+              </w:rPr>
+              <w:t>未识别</w:t>
+            </w:r>
+          </w:p>
+        </w:tc>
+        <w:tc>
+          <w:tcPr>
+            <w:tcW w:type="dxa" w:w="1680"/>
+            <w:vAlign w:val="center"/>
+          </w:tcPr>
+          <w:p>
+            <w:pPr>
+              <w:spacing w:before="0" w:after="0"/>
+            </w:pPr>
+            <w:r/>
+            <w:r>
+              <w:rPr>
+                <w:rFonts w:ascii="Calibri" w:hAnsi="Calibri" w:eastAsia="Songti SC"/>
+                <w:b w:val="0"/>
+                <w:color w:val="111827"/>
+                <w:sz w:val="16"/>
+              </w:rPr>
+              <w:t>AI 基础设施</w:t>
+            </w:r>
+          </w:p>
+        </w:tc>
+        <w:tc>
+          <w:tcPr>
+            <w:tcW w:type="dxa" w:w="900"/>
+            <w:vAlign w:val="center"/>
+          </w:tcPr>
+          <w:p>
+            <w:pPr>
+              <w:spacing w:before="0" w:after="0"/>
+              <w:jc w:val="center"/>
+            </w:pPr>
+            <w:r/>
+            <w:r>
+              <w:rPr>
+                <w:rFonts w:ascii="Calibri" w:hAnsi="Calibri" w:eastAsia="Songti SC"/>
                 <w:b/>
                 <w:color w:val="111827"/>
                 <w:sz w:val="17"/>
@@ -1621,7 +1730,7 @@
             <w:r/>
             <w:r>
               <w:rPr>
-                <w:rFonts w:ascii="Calibri" w:hAnsi="Calibri" w:eastAsia="Arial Unicode MS"/>
+                <w:rFonts w:ascii="Calibri" w:hAnsi="Calibri" w:eastAsia="Songti SC"/>
                 <w:b w:val="0"/>
                 <w:color w:val="111827"/>
                 <w:sz w:val="16"/>
@@ -1644,12 +1753,12 @@
             <w:r/>
             <w:r>
               <w:rPr>
-                <w:rFonts w:ascii="Calibri" w:hAnsi="Calibri" w:eastAsia="Arial Unicode MS"/>
+                <w:rFonts w:ascii="Calibri" w:hAnsi="Calibri" w:eastAsia="Songti SC"/>
                 <w:b w:val="0"/>
                 <w:color w:val="111827"/>
                 <w:sz w:val="17"/>
               </w:rPr>
-              <w:t>AI 数据中心电力成本：对西部绿电迁移叙事的压力测试及对算力贝塔毛利率的侵蚀</w:t>
+              <w:t>算力国产化闭环中的能源约束：电力供应与电网调峰压力分析</w:t>
             </w:r>
           </w:p>
         </w:tc>
@@ -1665,7 +1774,7 @@
             <w:r/>
             <w:r>
               <w:rPr>
-                <w:rFonts w:ascii="Calibri" w:hAnsi="Calibri" w:eastAsia="Arial Unicode MS"/>
+                <w:rFonts w:ascii="Calibri" w:hAnsi="Calibri" w:eastAsia="Songti SC"/>
                 <w:b w:val="0"/>
                 <w:color w:val="111827"/>
                 <w:sz w:val="16"/>
@@ -1686,7 +1795,7 @@
             <w:r/>
             <w:r>
               <w:rPr>
-                <w:rFonts w:ascii="Calibri" w:hAnsi="Calibri" w:eastAsia="Arial Unicode MS"/>
+                <w:rFonts w:ascii="Calibri" w:hAnsi="Calibri" w:eastAsia="Songti SC"/>
                 <w:b w:val="0"/>
                 <w:color w:val="111827"/>
                 <w:sz w:val="16"/>
@@ -1708,7 +1817,116 @@
             <w:r/>
             <w:r>
               <w:rPr>
-                <w:rFonts w:ascii="Calibri" w:hAnsi="Calibri" w:eastAsia="Arial Unicode MS"/>
+                <w:rFonts w:ascii="Calibri" w:hAnsi="Calibri" w:eastAsia="Songti SC"/>
+                <w:b/>
+                <w:color w:val="111827"/>
+                <w:sz w:val="17"/>
+              </w:rPr>
+              <w:t>49.6</w:t>
+            </w:r>
+          </w:p>
+        </w:tc>
+        <w:tc>
+          <w:tcPr>
+            <w:tcW w:type="dxa" w:w="1500"/>
+            <w:vAlign w:val="center"/>
+          </w:tcPr>
+          <w:p>
+            <w:pPr>
+              <w:spacing w:before="0" w:after="0"/>
+              <w:jc w:val="center"/>
+            </w:pPr>
+            <w:r/>
+            <w:r>
+              <w:rPr>
+                <w:rFonts w:ascii="Calibri" w:hAnsi="Calibri" w:eastAsia="Songti SC"/>
+                <w:b w:val="0"/>
+                <w:color w:val="111827"/>
+                <w:sz w:val="16"/>
+              </w:rPr>
+              <w:t>风险 3</w:t>
+            </w:r>
+          </w:p>
+        </w:tc>
+      </w:tr>
+      <w:tr>
+        <w:tc>
+          <w:tcPr>
+            <w:tcW w:type="dxa" w:w="3720"/>
+            <w:vAlign w:val="center"/>
+          </w:tcPr>
+          <w:p>
+            <w:pPr>
+              <w:spacing w:before="0" w:after="0"/>
+            </w:pPr>
+            <w:r/>
+            <w:r>
+              <w:rPr>
+                <w:rFonts w:ascii="Calibri" w:hAnsi="Calibri" w:eastAsia="Songti SC"/>
+                <w:b w:val="0"/>
+                <w:color w:val="111827"/>
+                <w:sz w:val="17"/>
+              </w:rPr>
+              <w:t>AI 数据中心电力成本：对西部绿电迁移叙事的压力测试及对算力贝塔毛利率的侵蚀</w:t>
+            </w:r>
+          </w:p>
+        </w:tc>
+        <w:tc>
+          <w:tcPr>
+            <w:tcW w:type="dxa" w:w="1560"/>
+            <w:vAlign w:val="center"/>
+          </w:tcPr>
+          <w:p>
+            <w:pPr>
+              <w:spacing w:before="0" w:after="0"/>
+            </w:pPr>
+            <w:r/>
+            <w:r>
+              <w:rPr>
+                <w:rFonts w:ascii="Calibri" w:hAnsi="Calibri" w:eastAsia="Songti SC"/>
+                <w:b w:val="0"/>
+                <w:color w:val="111827"/>
+                <w:sz w:val="16"/>
+              </w:rPr>
+              <w:t>未识别</w:t>
+            </w:r>
+          </w:p>
+        </w:tc>
+        <w:tc>
+          <w:tcPr>
+            <w:tcW w:type="dxa" w:w="1680"/>
+            <w:vAlign w:val="center"/>
+          </w:tcPr>
+          <w:p>
+            <w:pPr>
+              <w:spacing w:before="0" w:after="0"/>
+            </w:pPr>
+            <w:r/>
+            <w:r>
+              <w:rPr>
+                <w:rFonts w:ascii="Calibri" w:hAnsi="Calibri" w:eastAsia="Songti SC"/>
+                <w:b w:val="0"/>
+                <w:color w:val="111827"/>
+                <w:sz w:val="16"/>
+              </w:rPr>
+              <w:t>AI 基础设施</w:t>
+            </w:r>
+          </w:p>
+        </w:tc>
+        <w:tc>
+          <w:tcPr>
+            <w:tcW w:type="dxa" w:w="900"/>
+            <w:vAlign w:val="center"/>
+          </w:tcPr>
+          <w:p>
+            <w:pPr>
+              <w:spacing w:before="0" w:after="0"/>
+              <w:jc w:val="center"/>
+            </w:pPr>
+            <w:r/>
+            <w:r>
+              <w:rPr>
+                <w:rFonts w:ascii="Calibri" w:hAnsi="Calibri" w:eastAsia="Songti SC"/>
                 <w:b/>
                 <w:color w:val="111827"/>
                 <w:sz w:val="17"/>
@@ -1730,7 +1948,7 @@
             <w:r/>
             <w:r>
               <w:rPr>
-                <w:rFonts w:ascii="Calibri" w:hAnsi="Calibri" w:eastAsia="Arial Unicode MS"/>
+                <w:rFonts w:ascii="Calibri" w:hAnsi="Calibri" w:eastAsia="Songti SC"/>
                 <w:b w:val="0"/>
                 <w:color w:val="111827"/>
                 <w:sz w:val="16"/>
@@ -1753,7 +1971,7 @@
             <w:r/>
             <w:r>
               <w:rPr>
-                <w:rFonts w:ascii="Calibri" w:hAnsi="Calibri" w:eastAsia="Arial Unicode MS"/>
+                <w:rFonts w:ascii="Calibri" w:hAnsi="Calibri" w:eastAsia="Songti SC"/>
                 <w:b w:val="0"/>
                 <w:color w:val="111827"/>
                 <w:sz w:val="17"/>
@@ -1774,7 +1992,7 @@
             <w:r/>
             <w:r>
               <w:rPr>
-                <w:rFonts w:ascii="Calibri" w:hAnsi="Calibri" w:eastAsia="Arial Unicode MS"/>
+                <w:rFonts w:ascii="Calibri" w:hAnsi="Calibri" w:eastAsia="Songti SC"/>
                 <w:b w:val="0"/>
                 <w:color w:val="111827"/>
                 <w:sz w:val="16"/>
@@ -1795,7 +2013,7 @@
             <w:r/>
             <w:r>
               <w:rPr>
-                <w:rFonts w:ascii="Calibri" w:hAnsi="Calibri" w:eastAsia="Arial Unicode MS"/>
+                <w:rFonts w:ascii="Calibri" w:hAnsi="Calibri" w:eastAsia="Songti SC"/>
                 <w:b w:val="0"/>
                 <w:color w:val="111827"/>
                 <w:sz w:val="16"/>
@@ -1817,7 +2035,7 @@
             <w:r/>
             <w:r>
               <w:rPr>
-                <w:rFonts w:ascii="Calibri" w:hAnsi="Calibri" w:eastAsia="Arial Unicode MS"/>
+                <w:rFonts w:ascii="Calibri" w:hAnsi="Calibri" w:eastAsia="Songti SC"/>
                 <w:b/>
                 <w:color w:val="111827"/>
                 <w:sz w:val="17"/>
@@ -1839,7 +2057,7 @@
             <w:r/>
             <w:r>
               <w:rPr>
-                <w:rFonts w:ascii="Calibri" w:hAnsi="Calibri" w:eastAsia="Arial Unicode MS"/>
+                <w:rFonts w:ascii="Calibri" w:hAnsi="Calibri" w:eastAsia="Songti SC"/>
                 <w:b w:val="0"/>
                 <w:color w:val="111827"/>
                 <w:sz w:val="16"/>
@@ -1862,12 +2080,12 @@
             <w:r/>
             <w:r>
               <w:rPr>
-                <w:rFonts w:ascii="Calibri" w:hAnsi="Calibri" w:eastAsia="Arial Unicode MS"/>
+                <w:rFonts w:ascii="Calibri" w:hAnsi="Calibri" w:eastAsia="Songti SC"/>
                 <w:b w:val="0"/>
                 <w:color w:val="111827"/>
                 <w:sz w:val="17"/>
               </w:rPr>
-              <w:t>半导体设备与AI硬件产业链的自主化韧性及出口管制风险：高端制造缓冲的“应力测试”与三大裂纹</w:t>
+              <w:t>能源与电力政策反转对公路物流成本支撑力的侵蚀风险</w:t>
             </w:r>
           </w:p>
         </w:tc>
@@ -1883,7 +2101,7 @@
             <w:r/>
             <w:r>
               <w:rPr>
-                <w:rFonts w:ascii="Calibri" w:hAnsi="Calibri" w:eastAsia="Arial Unicode MS"/>
+                <w:rFonts w:ascii="Calibri" w:hAnsi="Calibri" w:eastAsia="Songti SC"/>
                 <w:b w:val="0"/>
                 <w:color w:val="111827"/>
                 <w:sz w:val="16"/>
@@ -1904,7 +2122,7 @@
             <w:r/>
             <w:r>
               <w:rPr>
-                <w:rFonts w:ascii="Calibri" w:hAnsi="Calibri" w:eastAsia="Arial Unicode MS"/>
+                <w:rFonts w:ascii="Calibri" w:hAnsi="Calibri" w:eastAsia="Songti SC"/>
                 <w:b w:val="0"/>
                 <w:color w:val="111827"/>
                 <w:sz w:val="16"/>
@@ -1926,12 +2144,12 @@
             <w:r/>
             <w:r>
               <w:rPr>
-                <w:rFonts w:ascii="Calibri" w:hAnsi="Calibri" w:eastAsia="Arial Unicode MS"/>
+                <w:rFonts w:ascii="Calibri" w:hAnsi="Calibri" w:eastAsia="Songti SC"/>
                 <w:b/>
                 <w:color w:val="111827"/>
                 <w:sz w:val="17"/>
               </w:rPr>
-              <w:t>47.2</w:t>
+              <w:t>48.3</w:t>
             </w:r>
           </w:p>
         </w:tc>
@@ -1948,7 +2166,116 @@
             <w:r/>
             <w:r>
               <w:rPr>
-                <w:rFonts w:ascii="Calibri" w:hAnsi="Calibri" w:eastAsia="Arial Unicode MS"/>
+                <w:rFonts w:ascii="Calibri" w:hAnsi="Calibri" w:eastAsia="Songti SC"/>
+                <w:b w:val="0"/>
+                <w:color w:val="111827"/>
+                <w:sz w:val="16"/>
+              </w:rPr>
+              <w:t>风险 1</w:t>
+            </w:r>
+          </w:p>
+        </w:tc>
+      </w:tr>
+      <w:tr>
+        <w:tc>
+          <w:tcPr>
+            <w:tcW w:type="dxa" w:w="3720"/>
+            <w:vAlign w:val="center"/>
+          </w:tcPr>
+          <w:p>
+            <w:pPr>
+              <w:spacing w:before="0" w:after="0"/>
+            </w:pPr>
+            <w:r/>
+            <w:r>
+              <w:rPr>
+                <w:rFonts w:ascii="Calibri" w:hAnsi="Calibri" w:eastAsia="Songti SC"/>
+                <w:b w:val="0"/>
+                <w:color w:val="111827"/>
+                <w:sz w:val="17"/>
+              </w:rPr>
+              <w:t>AI算力扩张下的能源成本与电力供应约束：成长股组合盈利能力的压力测试</w:t>
+            </w:r>
+          </w:p>
+        </w:tc>
+        <w:tc>
+          <w:tcPr>
+            <w:tcW w:type="dxa" w:w="1560"/>
+            <w:vAlign w:val="center"/>
+          </w:tcPr>
+          <w:p>
+            <w:pPr>
+              <w:spacing w:before="0" w:after="0"/>
+            </w:pPr>
+            <w:r/>
+            <w:r>
+              <w:rPr>
+                <w:rFonts w:ascii="Calibri" w:hAnsi="Calibri" w:eastAsia="Songti SC"/>
+                <w:b w:val="0"/>
+                <w:color w:val="111827"/>
+                <w:sz w:val="16"/>
+              </w:rPr>
+              <w:t>未识别</w:t>
+            </w:r>
+          </w:p>
+        </w:tc>
+        <w:tc>
+          <w:tcPr>
+            <w:tcW w:type="dxa" w:w="1680"/>
+            <w:vAlign w:val="center"/>
+          </w:tcPr>
+          <w:p>
+            <w:pPr>
+              <w:spacing w:before="0" w:after="0"/>
+            </w:pPr>
+            <w:r/>
+            <w:r>
+              <w:rPr>
+                <w:rFonts w:ascii="Calibri" w:hAnsi="Calibri" w:eastAsia="Songti SC"/>
+                <w:b w:val="0"/>
+                <w:color w:val="111827"/>
+                <w:sz w:val="16"/>
+              </w:rPr>
+              <w:t>AI 基础设施</w:t>
+            </w:r>
+          </w:p>
+        </w:tc>
+        <w:tc>
+          <w:tcPr>
+            <w:tcW w:type="dxa" w:w="900"/>
+            <w:vAlign w:val="center"/>
+          </w:tcPr>
+          <w:p>
+            <w:pPr>
+              <w:spacing w:before="0" w:after="0"/>
+              <w:jc w:val="center"/>
+            </w:pPr>
+            <w:r/>
+            <w:r>
+              <w:rPr>
+                <w:rFonts w:ascii="Calibri" w:hAnsi="Calibri" w:eastAsia="Songti SC"/>
+                <w:b/>
+                <w:color w:val="111827"/>
+                <w:sz w:val="17"/>
+              </w:rPr>
+              <w:t>47.9</w:t>
+            </w:r>
+          </w:p>
+        </w:tc>
+        <w:tc>
+          <w:tcPr>
+            <w:tcW w:type="dxa" w:w="1500"/>
+            <w:vAlign w:val="center"/>
+          </w:tcPr>
+          <w:p>
+            <w:pPr>
+              <w:spacing w:before="0" w:after="0"/>
+              <w:jc w:val="center"/>
+            </w:pPr>
+            <w:r/>
+            <w:r>
+              <w:rPr>
+                <w:rFonts w:ascii="Calibri" w:hAnsi="Calibri" w:eastAsia="Songti SC"/>
                 <w:b w:val="0"/>
                 <w:color w:val="111827"/>
                 <w:sz w:val="16"/>
@@ -1971,12 +2298,12 @@
             <w:r/>
             <w:r>
               <w:rPr>
-                <w:rFonts w:ascii="Calibri" w:hAnsi="Calibri" w:eastAsia="Arial Unicode MS"/>
+                <w:rFonts w:ascii="Calibri" w:hAnsi="Calibri" w:eastAsia="Songti SC"/>
                 <w:b w:val="0"/>
                 <w:color w:val="111827"/>
                 <w:sz w:val="17"/>
               </w:rPr>
-              <w:t>2026-06-01 电网瓶颈：公用事业成为 AI 电力落地的收费闸门</w:t>
+              <w:t>贸易壁垒升级背景下，AI算力链“国产替代”驱动的进攻端逻辑重构</w:t>
             </w:r>
           </w:p>
         </w:tc>
@@ -1992,7 +2319,7 @@
             <w:r/>
             <w:r>
               <w:rPr>
-                <w:rFonts w:ascii="Calibri" w:hAnsi="Calibri" w:eastAsia="Arial Unicode MS"/>
+                <w:rFonts w:ascii="Calibri" w:hAnsi="Calibri" w:eastAsia="Songti SC"/>
                 <w:b w:val="0"/>
                 <w:color w:val="111827"/>
                 <w:sz w:val="16"/>
@@ -2013,12 +2340,12 @@
             <w:r/>
             <w:r>
               <w:rPr>
-                <w:rFonts w:ascii="Calibri" w:hAnsi="Calibri" w:eastAsia="Arial Unicode MS"/>
+                <w:rFonts w:ascii="Calibri" w:hAnsi="Calibri" w:eastAsia="Songti SC"/>
                 <w:b w:val="0"/>
                 <w:color w:val="111827"/>
                 <w:sz w:val="16"/>
               </w:rPr>
-              <w:t>电力与电网</w:t>
+              <w:t>AI 基础设施</w:t>
             </w:r>
           </w:p>
         </w:tc>
@@ -2035,12 +2362,12 @@
             <w:r/>
             <w:r>
               <w:rPr>
-                <w:rFonts w:ascii="Calibri" w:hAnsi="Calibri" w:eastAsia="Arial Unicode MS"/>
+                <w:rFonts w:ascii="Calibri" w:hAnsi="Calibri" w:eastAsia="Songti SC"/>
                 <w:b/>
                 <w:color w:val="111827"/>
                 <w:sz w:val="17"/>
               </w:rPr>
-              <w:t>46.5</w:t>
+              <w:t>47.8</w:t>
             </w:r>
           </w:p>
         </w:tc>
@@ -2057,7 +2384,116 @@
             <w:r/>
             <w:r>
               <w:rPr>
-                <w:rFonts w:ascii="Calibri" w:hAnsi="Calibri" w:eastAsia="Arial Unicode MS"/>
+                <w:rFonts w:ascii="Calibri" w:hAnsi="Calibri" w:eastAsia="Songti SC"/>
+                <w:b w:val="0"/>
+                <w:color w:val="111827"/>
+                <w:sz w:val="16"/>
+              </w:rPr>
+              <w:t>风险 1</w:t>
+            </w:r>
+          </w:p>
+        </w:tc>
+      </w:tr>
+      <w:tr>
+        <w:tc>
+          <w:tcPr>
+            <w:tcW w:type="dxa" w:w="3720"/>
+            <w:vAlign w:val="center"/>
+          </w:tcPr>
+          <w:p>
+            <w:pPr>
+              <w:spacing w:before="0" w:after="0"/>
+            </w:pPr>
+            <w:r/>
+            <w:r>
+              <w:rPr>
+                <w:rFonts w:ascii="Calibri" w:hAnsi="Calibri" w:eastAsia="Songti SC"/>
+                <w:b w:val="0"/>
+                <w:color w:val="111827"/>
+                <w:sz w:val="17"/>
+              </w:rPr>
+              <w:t>半导体设备与AI硬件产业链的自主化韧性及出口管制风险：高端制造缓冲的“应力测试”与三大裂纹</w:t>
+            </w:r>
+          </w:p>
+        </w:tc>
+        <w:tc>
+          <w:tcPr>
+            <w:tcW w:type="dxa" w:w="1560"/>
+            <w:vAlign w:val="center"/>
+          </w:tcPr>
+          <w:p>
+            <w:pPr>
+              <w:spacing w:before="0" w:after="0"/>
+            </w:pPr>
+            <w:r/>
+            <w:r>
+              <w:rPr>
+                <w:rFonts w:ascii="Calibri" w:hAnsi="Calibri" w:eastAsia="Songti SC"/>
+                <w:b w:val="0"/>
+                <w:color w:val="111827"/>
+                <w:sz w:val="16"/>
+              </w:rPr>
+              <w:t>未识别</w:t>
+            </w:r>
+          </w:p>
+        </w:tc>
+        <w:tc>
+          <w:tcPr>
+            <w:tcW w:type="dxa" w:w="1680"/>
+            <w:vAlign w:val="center"/>
+          </w:tcPr>
+          <w:p>
+            <w:pPr>
+              <w:spacing w:before="0" w:after="0"/>
+            </w:pPr>
+            <w:r/>
+            <w:r>
+              <w:rPr>
+                <w:rFonts w:ascii="Calibri" w:hAnsi="Calibri" w:eastAsia="Songti SC"/>
+                <w:b w:val="0"/>
+                <w:color w:val="111827"/>
+                <w:sz w:val="16"/>
+              </w:rPr>
+              <w:t>宏观通胀传导</w:t>
+            </w:r>
+          </w:p>
+        </w:tc>
+        <w:tc>
+          <w:tcPr>
+            <w:tcW w:type="dxa" w:w="900"/>
+            <w:vAlign w:val="center"/>
+          </w:tcPr>
+          <w:p>
+            <w:pPr>
+              <w:spacing w:before="0" w:after="0"/>
+              <w:jc w:val="center"/>
+            </w:pPr>
+            <w:r/>
+            <w:r>
+              <w:rPr>
+                <w:rFonts w:ascii="Calibri" w:hAnsi="Calibri" w:eastAsia="Songti SC"/>
+                <w:b/>
+                <w:color w:val="111827"/>
+                <w:sz w:val="17"/>
+              </w:rPr>
+              <w:t>47.2</w:t>
+            </w:r>
+          </w:p>
+        </w:tc>
+        <w:tc>
+          <w:tcPr>
+            <w:tcW w:type="dxa" w:w="1500"/>
+            <w:vAlign w:val="center"/>
+          </w:tcPr>
+          <w:p>
+            <w:pPr>
+              <w:spacing w:before="0" w:after="0"/>
+              <w:jc w:val="center"/>
+            </w:pPr>
+            <w:r/>
+            <w:r>
+              <w:rPr>
+                <w:rFonts w:ascii="Calibri" w:hAnsi="Calibri" w:eastAsia="Songti SC"/>
                 <w:b w:val="0"/>
                 <w:color w:val="111827"/>
                 <w:sz w:val="16"/>
@@ -2080,7 +2516,116 @@
             <w:r/>
             <w:r>
               <w:rPr>
-                <w:rFonts w:ascii="Calibri" w:hAnsi="Calibri" w:eastAsia="Arial Unicode MS"/>
+                <w:rFonts w:ascii="Calibri" w:hAnsi="Calibri" w:eastAsia="Songti SC"/>
+                <w:b w:val="0"/>
+                <w:color w:val="111827"/>
+                <w:sz w:val="17"/>
+              </w:rPr>
+              <w:t>2026-06-01 电网瓶颈：公用事业成为 AI 电力落地的收费闸门</w:t>
+            </w:r>
+          </w:p>
+        </w:tc>
+        <w:tc>
+          <w:tcPr>
+            <w:tcW w:type="dxa" w:w="1560"/>
+            <w:vAlign w:val="center"/>
+          </w:tcPr>
+          <w:p>
+            <w:pPr>
+              <w:spacing w:before="0" w:after="0"/>
+            </w:pPr>
+            <w:r/>
+            <w:r>
+              <w:rPr>
+                <w:rFonts w:ascii="Calibri" w:hAnsi="Calibri" w:eastAsia="Songti SC"/>
+                <w:b w:val="0"/>
+                <w:color w:val="111827"/>
+                <w:sz w:val="16"/>
+              </w:rPr>
+              <w:t>未识别</w:t>
+            </w:r>
+          </w:p>
+        </w:tc>
+        <w:tc>
+          <w:tcPr>
+            <w:tcW w:type="dxa" w:w="1680"/>
+            <w:vAlign w:val="center"/>
+          </w:tcPr>
+          <w:p>
+            <w:pPr>
+              <w:spacing w:before="0" w:after="0"/>
+            </w:pPr>
+            <w:r/>
+            <w:r>
+              <w:rPr>
+                <w:rFonts w:ascii="Calibri" w:hAnsi="Calibri" w:eastAsia="Songti SC"/>
+                <w:b w:val="0"/>
+                <w:color w:val="111827"/>
+                <w:sz w:val="16"/>
+              </w:rPr>
+              <w:t>电力与电网</w:t>
+            </w:r>
+          </w:p>
+        </w:tc>
+        <w:tc>
+          <w:tcPr>
+            <w:tcW w:type="dxa" w:w="900"/>
+            <w:vAlign w:val="center"/>
+          </w:tcPr>
+          <w:p>
+            <w:pPr>
+              <w:spacing w:before="0" w:after="0"/>
+              <w:jc w:val="center"/>
+            </w:pPr>
+            <w:r/>
+            <w:r>
+              <w:rPr>
+                <w:rFonts w:ascii="Calibri" w:hAnsi="Calibri" w:eastAsia="Songti SC"/>
+                <w:b/>
+                <w:color w:val="111827"/>
+                <w:sz w:val="17"/>
+              </w:rPr>
+              <w:t>46.5</w:t>
+            </w:r>
+          </w:p>
+        </w:tc>
+        <w:tc>
+          <w:tcPr>
+            <w:tcW w:type="dxa" w:w="1500"/>
+            <w:vAlign w:val="center"/>
+          </w:tcPr>
+          <w:p>
+            <w:pPr>
+              <w:spacing w:before="0" w:after="0"/>
+              <w:jc w:val="center"/>
+            </w:pPr>
+            <w:r/>
+            <w:r>
+              <w:rPr>
+                <w:rFonts w:ascii="Calibri" w:hAnsi="Calibri" w:eastAsia="Songti SC"/>
+                <w:b w:val="0"/>
+                <w:color w:val="111827"/>
+                <w:sz w:val="16"/>
+              </w:rPr>
+              <w:t>风险 2</w:t>
+            </w:r>
+          </w:p>
+        </w:tc>
+      </w:tr>
+      <w:tr>
+        <w:tc>
+          <w:tcPr>
+            <w:tcW w:type="dxa" w:w="3720"/>
+            <w:vAlign w:val="center"/>
+          </w:tcPr>
+          <w:p>
+            <w:pPr>
+              <w:spacing w:before="0" w:after="0"/>
+            </w:pPr>
+            <w:r/>
+            <w:r>
+              <w:rPr>
+                <w:rFonts w:ascii="Calibri" w:hAnsi="Calibri" w:eastAsia="Songti SC"/>
                 <w:b w:val="0"/>
                 <w:color w:val="111827"/>
                 <w:sz w:val="17"/>
@@ -2101,7 +2646,7 @@
             <w:r/>
             <w:r>
               <w:rPr>
-                <w:rFonts w:ascii="Calibri" w:hAnsi="Calibri" w:eastAsia="Arial Unicode MS"/>
+                <w:rFonts w:ascii="Calibri" w:hAnsi="Calibri" w:eastAsia="Songti SC"/>
                 <w:b w:val="0"/>
                 <w:color w:val="111827"/>
                 <w:sz w:val="16"/>
@@ -2122,7 +2667,7 @@
             <w:r/>
             <w:r>
               <w:rPr>
-                <w:rFonts w:ascii="Calibri" w:hAnsi="Calibri" w:eastAsia="Arial Unicode MS"/>
+                <w:rFonts w:ascii="Calibri" w:hAnsi="Calibri" w:eastAsia="Songti SC"/>
                 <w:b w:val="0"/>
                 <w:color w:val="111827"/>
                 <w:sz w:val="16"/>
@@ -2144,7 +2689,7 @@
             <w:r/>
             <w:r>
               <w:rPr>
-                <w:rFonts w:ascii="Calibri" w:hAnsi="Calibri" w:eastAsia="Arial Unicode MS"/>
+                <w:rFonts w:ascii="Calibri" w:hAnsi="Calibri" w:eastAsia="Songti SC"/>
                 <w:b/>
                 <w:color w:val="111827"/>
                 <w:sz w:val="17"/>
@@ -2166,7 +2711,7 @@
             <w:r/>
             <w:r>
               <w:rPr>
-                <w:rFonts w:ascii="Calibri" w:hAnsi="Calibri" w:eastAsia="Arial Unicode MS"/>
+                <w:rFonts w:ascii="Calibri" w:hAnsi="Calibri" w:eastAsia="Songti SC"/>
                 <w:b w:val="0"/>
                 <w:color w:val="111827"/>
                 <w:sz w:val="16"/>
@@ -2189,12 +2734,12 @@
             <w:r/>
             <w:r>
               <w:rPr>
-                <w:rFonts w:ascii="Calibri" w:hAnsi="Calibri" w:eastAsia="Arial Unicode MS"/>
+                <w:rFonts w:ascii="Calibri" w:hAnsi="Calibri" w:eastAsia="Songti SC"/>
                 <w:b w:val="0"/>
                 <w:color w:val="111827"/>
                 <w:sz w:val="17"/>
               </w:rPr>
-              <w:t>prior research notes— AI 算力链的成本压力与流动性风险：半导体上游与电力成本能否支撑“算力贝...</w:t>
+              <w:t>科技出海进攻端（40%权重）的全球贸易政策与供应链管制风险评估</w:t>
             </w:r>
           </w:p>
         </w:tc>
@@ -2210,7 +2755,7 @@
             <w:r/>
             <w:r>
               <w:rPr>
-                <w:rFonts w:ascii="Calibri" w:hAnsi="Calibri" w:eastAsia="Arial Unicode MS"/>
+                <w:rFonts w:ascii="Calibri" w:hAnsi="Calibri" w:eastAsia="Songti SC"/>
                 <w:b w:val="0"/>
                 <w:color w:val="111827"/>
                 <w:sz w:val="16"/>
@@ -2231,12 +2776,12 @@
             <w:r/>
             <w:r>
               <w:rPr>
-                <w:rFonts w:ascii="Calibri" w:hAnsi="Calibri" w:eastAsia="Arial Unicode MS"/>
+                <w:rFonts w:ascii="Calibri" w:hAnsi="Calibri" w:eastAsia="Songti SC"/>
                 <w:b w:val="0"/>
                 <w:color w:val="111827"/>
                 <w:sz w:val="16"/>
               </w:rPr>
-              <w:t>AI 基础设施</w:t>
+              <w:t>宏观通胀传导</w:t>
             </w:r>
           </w:p>
         </w:tc>
@@ -2253,12 +2798,12 @@
             <w:r/>
             <w:r>
               <w:rPr>
-                <w:rFonts w:ascii="Calibri" w:hAnsi="Calibri" w:eastAsia="Arial Unicode MS"/>
+                <w:rFonts w:ascii="Calibri" w:hAnsi="Calibri" w:eastAsia="Songti SC"/>
                 <w:b/>
                 <w:color w:val="111827"/>
                 <w:sz w:val="17"/>
               </w:rPr>
-              <w:t>43.4</w:t>
+              <w:t>45.0</w:t>
             </w:r>
           </w:p>
         </w:tc>
@@ -2275,7 +2820,116 @@
             <w:r/>
             <w:r>
               <w:rPr>
-                <w:rFonts w:ascii="Calibri" w:hAnsi="Calibri" w:eastAsia="Arial Unicode MS"/>
+                <w:rFonts w:ascii="Calibri" w:hAnsi="Calibri" w:eastAsia="Songti SC"/>
+                <w:b w:val="0"/>
+                <w:color w:val="111827"/>
+                <w:sz w:val="16"/>
+              </w:rPr>
+              <w:t>风险 2</w:t>
+            </w:r>
+          </w:p>
+        </w:tc>
+      </w:tr>
+      <w:tr>
+        <w:tc>
+          <w:tcPr>
+            <w:tcW w:type="dxa" w:w="3720"/>
+            <w:vAlign w:val="center"/>
+          </w:tcPr>
+          <w:p>
+            <w:pPr>
+              <w:spacing w:before="0" w:after="0"/>
+            </w:pPr>
+            <w:r/>
+            <w:r>
+              <w:rPr>
+                <w:rFonts w:ascii="Calibri" w:hAnsi="Calibri" w:eastAsia="Songti SC"/>
+                <w:b w:val="0"/>
+                <w:color w:val="111827"/>
+                <w:sz w:val="17"/>
+              </w:rPr>
+              <w:t>核心农产品价格周期与餐饮供应链成本护城河的压力测试</w:t>
+            </w:r>
+          </w:p>
+        </w:tc>
+        <w:tc>
+          <w:tcPr>
+            <w:tcW w:type="dxa" w:w="1560"/>
+            <w:vAlign w:val="center"/>
+          </w:tcPr>
+          <w:p>
+            <w:pPr>
+              <w:spacing w:before="0" w:after="0"/>
+            </w:pPr>
+            <w:r/>
+            <w:r>
+              <w:rPr>
+                <w:rFonts w:ascii="Calibri" w:hAnsi="Calibri" w:eastAsia="Songti SC"/>
+                <w:b w:val="0"/>
+                <w:color w:val="111827"/>
+                <w:sz w:val="16"/>
+              </w:rPr>
+              <w:t>未识别</w:t>
+            </w:r>
+          </w:p>
+        </w:tc>
+        <w:tc>
+          <w:tcPr>
+            <w:tcW w:type="dxa" w:w="1680"/>
+            <w:vAlign w:val="center"/>
+          </w:tcPr>
+          <w:p>
+            <w:pPr>
+              <w:spacing w:before="0" w:after="0"/>
+            </w:pPr>
+            <w:r/>
+            <w:r>
+              <w:rPr>
+                <w:rFonts w:ascii="Calibri" w:hAnsi="Calibri" w:eastAsia="Songti SC"/>
+                <w:b w:val="0"/>
+                <w:color w:val="111827"/>
+                <w:sz w:val="16"/>
+              </w:rPr>
+              <w:t>宏观通胀传导</w:t>
+            </w:r>
+          </w:p>
+        </w:tc>
+        <w:tc>
+          <w:tcPr>
+            <w:tcW w:type="dxa" w:w="900"/>
+            <w:vAlign w:val="center"/>
+          </w:tcPr>
+          <w:p>
+            <w:pPr>
+              <w:spacing w:before="0" w:after="0"/>
+              <w:jc w:val="center"/>
+            </w:pPr>
+            <w:r/>
+            <w:r>
+              <w:rPr>
+                <w:rFonts w:ascii="Calibri" w:hAnsi="Calibri" w:eastAsia="Songti SC"/>
+                <w:b/>
+                <w:color w:val="111827"/>
+                <w:sz w:val="17"/>
+              </w:rPr>
+              <w:t>45.0</w:t>
+            </w:r>
+          </w:p>
+        </w:tc>
+        <w:tc>
+          <w:tcPr>
+            <w:tcW w:type="dxa" w:w="1500"/>
+            <w:vAlign w:val="center"/>
+          </w:tcPr>
+          <w:p>
+            <w:pPr>
+              <w:spacing w:before="0" w:after="0"/>
+              <w:jc w:val="center"/>
+            </w:pPr>
+            <w:r/>
+            <w:r>
+              <w:rPr>
+                <w:rFonts w:ascii="Calibri" w:hAnsi="Calibri" w:eastAsia="Songti SC"/>
                 <w:b w:val="0"/>
                 <w:color w:val="111827"/>
                 <w:sz w:val="16"/>
@@ -2298,12 +2952,12 @@
             <w:r/>
             <w:r>
               <w:rPr>
-                <w:rFonts w:ascii="Calibri" w:hAnsi="Calibri" w:eastAsia="Arial Unicode MS"/>
+                <w:rFonts w:ascii="Calibri" w:hAnsi="Calibri" w:eastAsia="Songti SC"/>
                 <w:b w:val="0"/>
                 <w:color w:val="111827"/>
                 <w:sz w:val="17"/>
               </w:rPr>
-              <w:t>WLEF物理实体防线 vs. 算力贝塔毛利挤压：全局杠铃再平衡策略与资产压力测试</w:t>
+              <w:t>制造业去库存下的基础材料需求与利润率压力测试</w:t>
             </w:r>
           </w:p>
         </w:tc>
@@ -2319,7 +2973,7 @@
             <w:r/>
             <w:r>
               <w:rPr>
-                <w:rFonts w:ascii="Calibri" w:hAnsi="Calibri" w:eastAsia="Arial Unicode MS"/>
+                <w:rFonts w:ascii="Calibri" w:hAnsi="Calibri" w:eastAsia="Songti SC"/>
                 <w:b w:val="0"/>
                 <w:color w:val="111827"/>
                 <w:sz w:val="16"/>
@@ -2340,7 +2994,116 @@
             <w:r/>
             <w:r>
               <w:rPr>
-                <w:rFonts w:ascii="Calibri" w:hAnsi="Calibri" w:eastAsia="Arial Unicode MS"/>
+                <w:rFonts w:ascii="Calibri" w:hAnsi="Calibri" w:eastAsia="Songti SC"/>
+                <w:b w:val="0"/>
+                <w:color w:val="111827"/>
+                <w:sz w:val="16"/>
+              </w:rPr>
+              <w:t>宏观通胀传导</w:t>
+            </w:r>
+          </w:p>
+        </w:tc>
+        <w:tc>
+          <w:tcPr>
+            <w:tcW w:type="dxa" w:w="900"/>
+            <w:vAlign w:val="center"/>
+          </w:tcPr>
+          <w:p>
+            <w:pPr>
+              <w:spacing w:before="0" w:after="0"/>
+              <w:jc w:val="center"/>
+            </w:pPr>
+            <w:r/>
+            <w:r>
+              <w:rPr>
+                <w:rFonts w:ascii="Calibri" w:hAnsi="Calibri" w:eastAsia="Songti SC"/>
+                <w:b/>
+                <w:color w:val="111827"/>
+                <w:sz w:val="17"/>
+              </w:rPr>
+              <w:t>44.8</w:t>
+            </w:r>
+          </w:p>
+        </w:tc>
+        <w:tc>
+          <w:tcPr>
+            <w:tcW w:type="dxa" w:w="1500"/>
+            <w:vAlign w:val="center"/>
+          </w:tcPr>
+          <w:p>
+            <w:pPr>
+              <w:spacing w:before="0" w:after="0"/>
+              <w:jc w:val="center"/>
+            </w:pPr>
+            <w:r/>
+            <w:r>
+              <w:rPr>
+                <w:rFonts w:ascii="Calibri" w:hAnsi="Calibri" w:eastAsia="Songti SC"/>
+                <w:b w:val="0"/>
+                <w:color w:val="111827"/>
+                <w:sz w:val="16"/>
+              </w:rPr>
+              <w:t>风险 2</w:t>
+            </w:r>
+          </w:p>
+        </w:tc>
+      </w:tr>
+      <w:tr>
+        <w:tc>
+          <w:tcPr>
+            <w:tcW w:type="dxa" w:w="3720"/>
+            <w:vAlign w:val="center"/>
+          </w:tcPr>
+          <w:p>
+            <w:pPr>
+              <w:spacing w:before="0" w:after="0"/>
+            </w:pPr>
+            <w:r/>
+            <w:r>
+              <w:rPr>
+                <w:rFonts w:ascii="Calibri" w:hAnsi="Calibri" w:eastAsia="Songti SC"/>
+                <w:b w:val="0"/>
+                <w:color w:val="111827"/>
+                <w:sz w:val="17"/>
+              </w:rPr>
+              <w:t>绿电直连成本上升对AI算力中心建设成本及算力布局的影响</w:t>
+            </w:r>
+          </w:p>
+        </w:tc>
+        <w:tc>
+          <w:tcPr>
+            <w:tcW w:type="dxa" w:w="1560"/>
+            <w:vAlign w:val="center"/>
+          </w:tcPr>
+          <w:p>
+            <w:pPr>
+              <w:spacing w:before="0" w:after="0"/>
+            </w:pPr>
+            <w:r/>
+            <w:r>
+              <w:rPr>
+                <w:rFonts w:ascii="Calibri" w:hAnsi="Calibri" w:eastAsia="Songti SC"/>
+                <w:b w:val="0"/>
+                <w:color w:val="111827"/>
+                <w:sz w:val="16"/>
+              </w:rPr>
+              <w:t>未识别</w:t>
+            </w:r>
+          </w:p>
+        </w:tc>
+        <w:tc>
+          <w:tcPr>
+            <w:tcW w:type="dxa" w:w="1680"/>
+            <w:vAlign w:val="center"/>
+          </w:tcPr>
+          <w:p>
+            <w:pPr>
+              <w:spacing w:before="0" w:after="0"/>
+            </w:pPr>
+            <w:r/>
+            <w:r>
+              <w:rPr>
+                <w:rFonts w:ascii="Calibri" w:hAnsi="Calibri" w:eastAsia="Songti SC"/>
                 <w:b w:val="0"/>
                 <w:color w:val="111827"/>
                 <w:sz w:val="16"/>
@@ -2362,12 +3125,12 @@
             <w:r/>
             <w:r>
               <w:rPr>
-                <w:rFonts w:ascii="Calibri" w:hAnsi="Calibri" w:eastAsia="Arial Unicode MS"/>
+                <w:rFonts w:ascii="Calibri" w:hAnsi="Calibri" w:eastAsia="Songti SC"/>
                 <w:b/>
                 <w:color w:val="111827"/>
                 <w:sz w:val="17"/>
               </w:rPr>
-              <w:t>43.2</w:t>
+              <w:t>44.0</w:t>
             </w:r>
           </w:p>
         </w:tc>
@@ -2384,7 +3147,7 @@
             <w:r/>
             <w:r>
               <w:rPr>
-                <w:rFonts w:ascii="Calibri" w:hAnsi="Calibri" w:eastAsia="Arial Unicode MS"/>
+                <w:rFonts w:ascii="Calibri" w:hAnsi="Calibri" w:eastAsia="Songti SC"/>
                 <w:b w:val="0"/>
                 <w:color w:val="111827"/>
                 <w:sz w:val="16"/>
@@ -2407,12 +3170,12 @@
             <w:r/>
             <w:r>
               <w:rPr>
-                <w:rFonts w:ascii="Calibri" w:hAnsi="Calibri" w:eastAsia="Arial Unicode MS"/>
+                <w:rFonts w:ascii="Calibri" w:hAnsi="Calibri" w:eastAsia="Songti SC"/>
                 <w:b w:val="0"/>
                 <w:color w:val="111827"/>
                 <w:sz w:val="17"/>
               </w:rPr>
-              <w:t>prior research notes— SiC 价格战的产业链利润重塑与半导体板块配置逻辑演变（综合卡）</w:t>
+              <w:t>核心观点 / Thesis</w:t>
             </w:r>
           </w:p>
         </w:tc>
@@ -2428,7 +3191,7 @@
             <w:r/>
             <w:r>
               <w:rPr>
-                <w:rFonts w:ascii="Calibri" w:hAnsi="Calibri" w:eastAsia="Arial Unicode MS"/>
+                <w:rFonts w:ascii="Calibri" w:hAnsi="Calibri" w:eastAsia="Songti SC"/>
                 <w:b w:val="0"/>
                 <w:color w:val="111827"/>
                 <w:sz w:val="16"/>
@@ -2449,12 +3212,12 @@
             <w:r/>
             <w:r>
               <w:rPr>
-                <w:rFonts w:ascii="Calibri" w:hAnsi="Calibri" w:eastAsia="Arial Unicode MS"/>
+                <w:rFonts w:ascii="Calibri" w:hAnsi="Calibri" w:eastAsia="Songti SC"/>
                 <w:b w:val="0"/>
                 <w:color w:val="111827"/>
                 <w:sz w:val="16"/>
               </w:rPr>
-              <w:t>宏观通胀传导</w:t>
+              <w:t>AI 基础设施</w:t>
             </w:r>
           </w:p>
         </w:tc>
@@ -2471,12 +3234,12 @@
             <w:r/>
             <w:r>
               <w:rPr>
-                <w:rFonts w:ascii="Calibri" w:hAnsi="Calibri" w:eastAsia="Arial Unicode MS"/>
+                <w:rFonts w:ascii="Calibri" w:hAnsi="Calibri" w:eastAsia="Songti SC"/>
                 <w:b/>
                 <w:color w:val="111827"/>
                 <w:sz w:val="17"/>
               </w:rPr>
-              <w:t>42.9</w:t>
+              <w:t>43.9</w:t>
             </w:r>
           </w:p>
         </w:tc>
@@ -2493,7 +3256,7 @@
             <w:r/>
             <w:r>
               <w:rPr>
-                <w:rFonts w:ascii="Calibri" w:hAnsi="Calibri" w:eastAsia="Arial Unicode MS"/>
+                <w:rFonts w:ascii="Calibri" w:hAnsi="Calibri" w:eastAsia="Songti SC"/>
                 <w:b w:val="0"/>
                 <w:color w:val="111827"/>
                 <w:sz w:val="16"/>
@@ -2516,12 +3279,12 @@
             <w:r/>
             <w:r>
               <w:rPr>
-                <w:rFonts w:ascii="Calibri" w:hAnsi="Calibri" w:eastAsia="Arial Unicode MS"/>
+                <w:rFonts w:ascii="Calibri" w:hAnsi="Calibri" w:eastAsia="Songti SC"/>
                 <w:b w:val="0"/>
                 <w:color w:val="111827"/>
                 <w:sz w:val="17"/>
               </w:rPr>
-              <w:t>电网装备与功率半导体国产化替代的韧性：电网侧 SiC/IGBT 能否支撑 2027 年后的基本盘？</w:t>
+              <w:t>2026-06-01 材料行业视角下的科创50红利-成长杠铃压力测试</w:t>
             </w:r>
           </w:p>
         </w:tc>
@@ -2537,7 +3300,7 @@
             <w:r/>
             <w:r>
               <w:rPr>
-                <w:rFonts w:ascii="Calibri" w:hAnsi="Calibri" w:eastAsia="Arial Unicode MS"/>
+                <w:rFonts w:ascii="Calibri" w:hAnsi="Calibri" w:eastAsia="Songti SC"/>
                 <w:b w:val="0"/>
                 <w:color w:val="111827"/>
                 <w:sz w:val="16"/>
@@ -2558,7 +3321,7 @@
             <w:r/>
             <w:r>
               <w:rPr>
-                <w:rFonts w:ascii="Calibri" w:hAnsi="Calibri" w:eastAsia="Arial Unicode MS"/>
+                <w:rFonts w:ascii="Calibri" w:hAnsi="Calibri" w:eastAsia="Songti SC"/>
                 <w:b w:val="0"/>
                 <w:color w:val="111827"/>
                 <w:sz w:val="16"/>
@@ -2580,12 +3343,12 @@
             <w:r/>
             <w:r>
               <w:rPr>
-                <w:rFonts w:ascii="Calibri" w:hAnsi="Calibri" w:eastAsia="Arial Unicode MS"/>
+                <w:rFonts w:ascii="Calibri" w:hAnsi="Calibri" w:eastAsia="Songti SC"/>
                 <w:b/>
                 <w:color w:val="111827"/>
                 <w:sz w:val="17"/>
               </w:rPr>
-              <w:t>42.8</w:t>
+              <w:t>43.8</w:t>
             </w:r>
           </w:p>
         </w:tc>
@@ -2602,770 +3365,7 @@
             <w:r/>
             <w:r>
               <w:rPr>
-                <w:rFonts w:ascii="Calibri" w:hAnsi="Calibri" w:eastAsia="Arial Unicode MS"/>
-                <w:b w:val="0"/>
-                <w:color w:val="111827"/>
-                <w:sz w:val="16"/>
-              </w:rPr>
-              <w:t>风险 1</w:t>
-            </w:r>
-          </w:p>
-        </w:tc>
-      </w:tr>
-      <w:tr>
-        <w:tc>
-          <w:tcPr>
-            <w:tcW w:type="dxa" w:w="3720"/>
-            <w:vAlign w:val="center"/>
-          </w:tcPr>
-          <w:p>
-            <w:pPr>
-              <w:spacing w:before="0" w:after="0"/>
-            </w:pPr>
-            <w:r/>
-            <w:r>
-              <w:rPr>
-                <w:rFonts w:ascii="Calibri" w:hAnsi="Calibri" w:eastAsia="Arial Unicode MS"/>
-                <w:b w:val="0"/>
-                <w:color w:val="111827"/>
-                <w:sz w:val="17"/>
-              </w:rPr>
-              <w:t>能源供应侧：AI 时代核能、SMR 与可再生能源的产能扩张边界</w:t>
-            </w:r>
-          </w:p>
-        </w:tc>
-        <w:tc>
-          <w:tcPr>
-            <w:tcW w:type="dxa" w:w="1560"/>
-            <w:vAlign w:val="center"/>
-          </w:tcPr>
-          <w:p>
-            <w:pPr>
-              <w:spacing w:before="0" w:after="0"/>
-            </w:pPr>
-            <w:r/>
-            <w:r>
-              <w:rPr>
-                <w:rFonts w:ascii="Calibri" w:hAnsi="Calibri" w:eastAsia="Arial Unicode MS"/>
-                <w:b w:val="0"/>
-                <w:color w:val="111827"/>
-                <w:sz w:val="16"/>
-              </w:rPr>
-              <w:t>未识别</w:t>
-            </w:r>
-          </w:p>
-        </w:tc>
-        <w:tc>
-          <w:tcPr>
-            <w:tcW w:type="dxa" w:w="1680"/>
-            <w:vAlign w:val="center"/>
-          </w:tcPr>
-          <w:p>
-            <w:pPr>
-              <w:spacing w:before="0" w:after="0"/>
-            </w:pPr>
-            <w:r/>
-            <w:r>
-              <w:rPr>
-                <w:rFonts w:ascii="Calibri" w:hAnsi="Calibri" w:eastAsia="Arial Unicode MS"/>
-                <w:b w:val="0"/>
-                <w:color w:val="111827"/>
-                <w:sz w:val="16"/>
-              </w:rPr>
-              <w:t>宏观通胀传导</w:t>
-            </w:r>
-          </w:p>
-        </w:tc>
-        <w:tc>
-          <w:tcPr>
-            <w:tcW w:type="dxa" w:w="900"/>
-            <w:vAlign w:val="center"/>
-          </w:tcPr>
-          <w:p>
-            <w:pPr>
-              <w:spacing w:before="0" w:after="0"/>
-              <w:jc w:val="center"/>
-            </w:pPr>
-            <w:r/>
-            <w:r>
-              <w:rPr>
-                <w:rFonts w:ascii="Calibri" w:hAnsi="Calibri" w:eastAsia="Arial Unicode MS"/>
-                <w:b/>
-                <w:color w:val="111827"/>
-                <w:sz w:val="17"/>
-              </w:rPr>
-              <w:t>42.7</w:t>
-            </w:r>
-          </w:p>
-        </w:tc>
-        <w:tc>
-          <w:tcPr>
-            <w:tcW w:type="dxa" w:w="1500"/>
-            <w:vAlign w:val="center"/>
-          </w:tcPr>
-          <w:p>
-            <w:pPr>
-              <w:spacing w:before="0" w:after="0"/>
-              <w:jc w:val="center"/>
-            </w:pPr>
-            <w:r/>
-            <w:r>
-              <w:rPr>
-                <w:rFonts w:ascii="Calibri" w:hAnsi="Calibri" w:eastAsia="Arial Unicode MS"/>
-                <w:b w:val="0"/>
-                <w:color w:val="111827"/>
-                <w:sz w:val="16"/>
-              </w:rPr>
-              <w:t>风险 1</w:t>
-            </w:r>
-          </w:p>
-        </w:tc>
-      </w:tr>
-      <w:tr>
-        <w:tc>
-          <w:tcPr>
-            <w:tcW w:type="dxa" w:w="3720"/>
-            <w:vAlign w:val="center"/>
-          </w:tcPr>
-          <w:p>
-            <w:pPr>
-              <w:spacing w:before="0" w:after="0"/>
-            </w:pPr>
-            <w:r/>
-            <w:r>
-              <w:rPr>
-                <w:rFonts w:ascii="Calibri" w:hAnsi="Calibri" w:eastAsia="Arial Unicode MS"/>
-                <w:b w:val="0"/>
-                <w:color w:val="111827"/>
-                <w:sz w:val="17"/>
-              </w:rPr>
-              <w:t>极端低温供应受限下的量子芯片半导体工艺韧性评估（2026-06-01）</w:t>
-            </w:r>
-          </w:p>
-        </w:tc>
-        <w:tc>
-          <w:tcPr>
-            <w:tcW w:type="dxa" w:w="1560"/>
-            <w:vAlign w:val="center"/>
-          </w:tcPr>
-          <w:p>
-            <w:pPr>
-              <w:spacing w:before="0" w:after="0"/>
-            </w:pPr>
-            <w:r/>
-            <w:r>
-              <w:rPr>
-                <w:rFonts w:ascii="Calibri" w:hAnsi="Calibri" w:eastAsia="Arial Unicode MS"/>
-                <w:b w:val="0"/>
-                <w:color w:val="111827"/>
-                <w:sz w:val="16"/>
-              </w:rPr>
-              <w:t>未识别</w:t>
-            </w:r>
-          </w:p>
-        </w:tc>
-        <w:tc>
-          <w:tcPr>
-            <w:tcW w:type="dxa" w:w="1680"/>
-            <w:vAlign w:val="center"/>
-          </w:tcPr>
-          <w:p>
-            <w:pPr>
-              <w:spacing w:before="0" w:after="0"/>
-            </w:pPr>
-            <w:r/>
-            <w:r>
-              <w:rPr>
-                <w:rFonts w:ascii="Calibri" w:hAnsi="Calibri" w:eastAsia="Arial Unicode MS"/>
-                <w:b w:val="0"/>
-                <w:color w:val="111827"/>
-                <w:sz w:val="16"/>
-              </w:rPr>
-              <w:t>半导体与存储</w:t>
-            </w:r>
-          </w:p>
-        </w:tc>
-        <w:tc>
-          <w:tcPr>
-            <w:tcW w:type="dxa" w:w="900"/>
-            <w:vAlign w:val="center"/>
-          </w:tcPr>
-          <w:p>
-            <w:pPr>
-              <w:spacing w:before="0" w:after="0"/>
-              <w:jc w:val="center"/>
-            </w:pPr>
-            <w:r/>
-            <w:r>
-              <w:rPr>
-                <w:rFonts w:ascii="Calibri" w:hAnsi="Calibri" w:eastAsia="Arial Unicode MS"/>
-                <w:b/>
-                <w:color w:val="111827"/>
-                <w:sz w:val="17"/>
-              </w:rPr>
-              <w:t>42.7</w:t>
-            </w:r>
-          </w:p>
-        </w:tc>
-        <w:tc>
-          <w:tcPr>
-            <w:tcW w:type="dxa" w:w="1500"/>
-            <w:vAlign w:val="center"/>
-          </w:tcPr>
-          <w:p>
-            <w:pPr>
-              <w:spacing w:before="0" w:after="0"/>
-              <w:jc w:val="center"/>
-            </w:pPr>
-            <w:r/>
-            <w:r>
-              <w:rPr>
-                <w:rFonts w:ascii="Calibri" w:hAnsi="Calibri" w:eastAsia="Arial Unicode MS"/>
-                <w:b w:val="0"/>
-                <w:color w:val="111827"/>
-                <w:sz w:val="16"/>
-              </w:rPr>
-              <w:t>风险 1</w:t>
-            </w:r>
-          </w:p>
-        </w:tc>
-      </w:tr>
-      <w:tr>
-        <w:tc>
-          <w:tcPr>
-            <w:tcW w:type="dxa" w:w="3720"/>
-            <w:vAlign w:val="center"/>
-          </w:tcPr>
-          <w:p>
-            <w:pPr>
-              <w:spacing w:before="0" w:after="0"/>
-            </w:pPr>
-            <w:r/>
-            <w:r>
-              <w:rPr>
-                <w:rFonts w:ascii="Calibri" w:hAnsi="Calibri" w:eastAsia="Arial Unicode MS"/>
-                <w:b w:val="0"/>
-                <w:color w:val="111827"/>
-                <w:sz w:val="17"/>
-              </w:rPr>
-              <w:t>前序研究 — 铜、铝与电工钢：AI 电网背后的"第二次 Capex 冲击"</w:t>
-            </w:r>
-          </w:p>
-        </w:tc>
-        <w:tc>
-          <w:tcPr>
-            <w:tcW w:type="dxa" w:w="1560"/>
-            <w:vAlign w:val="center"/>
-          </w:tcPr>
-          <w:p>
-            <w:pPr>
-              <w:spacing w:before="0" w:after="0"/>
-            </w:pPr>
-            <w:r/>
-            <w:r>
-              <w:rPr>
-                <w:rFonts w:ascii="Calibri" w:hAnsi="Calibri" w:eastAsia="Arial Unicode MS"/>
-                <w:b w:val="0"/>
-                <w:color w:val="111827"/>
-                <w:sz w:val="16"/>
-              </w:rPr>
-              <w:t>未识别</w:t>
-            </w:r>
-          </w:p>
-        </w:tc>
-        <w:tc>
-          <w:tcPr>
-            <w:tcW w:type="dxa" w:w="1680"/>
-            <w:vAlign w:val="center"/>
-          </w:tcPr>
-          <w:p>
-            <w:pPr>
-              <w:spacing w:before="0" w:after="0"/>
-            </w:pPr>
-            <w:r/>
-            <w:r>
-              <w:rPr>
-                <w:rFonts w:ascii="Calibri" w:hAnsi="Calibri" w:eastAsia="Arial Unicode MS"/>
-                <w:b w:val="0"/>
-                <w:color w:val="111827"/>
-                <w:sz w:val="16"/>
-              </w:rPr>
-              <w:t>AI 基础设施</w:t>
-            </w:r>
-          </w:p>
-        </w:tc>
-        <w:tc>
-          <w:tcPr>
-            <w:tcW w:type="dxa" w:w="900"/>
-            <w:vAlign w:val="center"/>
-          </w:tcPr>
-          <w:p>
-            <w:pPr>
-              <w:spacing w:before="0" w:after="0"/>
-              <w:jc w:val="center"/>
-            </w:pPr>
-            <w:r/>
-            <w:r>
-              <w:rPr>
-                <w:rFonts w:ascii="Calibri" w:hAnsi="Calibri" w:eastAsia="Arial Unicode MS"/>
-                <w:b/>
-                <w:color w:val="111827"/>
-                <w:sz w:val="17"/>
-              </w:rPr>
-              <w:t>42.3</w:t>
-            </w:r>
-          </w:p>
-        </w:tc>
-        <w:tc>
-          <w:tcPr>
-            <w:tcW w:type="dxa" w:w="1500"/>
-            <w:vAlign w:val="center"/>
-          </w:tcPr>
-          <w:p>
-            <w:pPr>
-              <w:spacing w:before="0" w:after="0"/>
-              <w:jc w:val="center"/>
-            </w:pPr>
-            <w:r/>
-            <w:r>
-              <w:rPr>
-                <w:rFonts w:ascii="Calibri" w:hAnsi="Calibri" w:eastAsia="Arial Unicode MS"/>
-                <w:b w:val="0"/>
-                <w:color w:val="111827"/>
-                <w:sz w:val="16"/>
-              </w:rPr>
-              <w:t>风险 1</w:t>
-            </w:r>
-          </w:p>
-        </w:tc>
-      </w:tr>
-      <w:tr>
-        <w:tc>
-          <w:tcPr>
-            <w:tcW w:type="dxa" w:w="3720"/>
-            <w:vAlign w:val="center"/>
-          </w:tcPr>
-          <w:p>
-            <w:pPr>
-              <w:spacing w:before="0" w:after="0"/>
-            </w:pPr>
-            <w:r/>
-            <w:r>
-              <w:rPr>
-                <w:rFonts w:ascii="Calibri" w:hAnsi="Calibri" w:eastAsia="Arial Unicode MS"/>
-                <w:b w:val="0"/>
-                <w:color w:val="111827"/>
-                <w:sz w:val="17"/>
-              </w:rPr>
-              <w:t>2026-06-01 全球宏观卡：需求承压，但尚未断裂</w:t>
-            </w:r>
-          </w:p>
-        </w:tc>
-        <w:tc>
-          <w:tcPr>
-            <w:tcW w:type="dxa" w:w="1560"/>
-            <w:vAlign w:val="center"/>
-          </w:tcPr>
-          <w:p>
-            <w:pPr>
-              <w:spacing w:before="0" w:after="0"/>
-            </w:pPr>
-            <w:r/>
-            <w:r>
-              <w:rPr>
-                <w:rFonts w:ascii="Calibri" w:hAnsi="Calibri" w:eastAsia="Arial Unicode MS"/>
-                <w:b w:val="0"/>
-                <w:color w:val="111827"/>
-                <w:sz w:val="16"/>
-              </w:rPr>
-              <w:t>未识别</w:t>
-            </w:r>
-          </w:p>
-        </w:tc>
-        <w:tc>
-          <w:tcPr>
-            <w:tcW w:type="dxa" w:w="1680"/>
-            <w:vAlign w:val="center"/>
-          </w:tcPr>
-          <w:p>
-            <w:pPr>
-              <w:spacing w:before="0" w:after="0"/>
-            </w:pPr>
-            <w:r/>
-            <w:r>
-              <w:rPr>
-                <w:rFonts w:ascii="Calibri" w:hAnsi="Calibri" w:eastAsia="Arial Unicode MS"/>
-                <w:b w:val="0"/>
-                <w:color w:val="111827"/>
-                <w:sz w:val="16"/>
-              </w:rPr>
-              <w:t>宏观通胀传导</w:t>
-            </w:r>
-          </w:p>
-        </w:tc>
-        <w:tc>
-          <w:tcPr>
-            <w:tcW w:type="dxa" w:w="900"/>
-            <w:vAlign w:val="center"/>
-          </w:tcPr>
-          <w:p>
-            <w:pPr>
-              <w:spacing w:before="0" w:after="0"/>
-              <w:jc w:val="center"/>
-            </w:pPr>
-            <w:r/>
-            <w:r>
-              <w:rPr>
-                <w:rFonts w:ascii="Calibri" w:hAnsi="Calibri" w:eastAsia="Arial Unicode MS"/>
-                <w:b/>
-                <w:color w:val="111827"/>
-                <w:sz w:val="17"/>
-              </w:rPr>
-              <w:t>41.8</w:t>
-            </w:r>
-          </w:p>
-        </w:tc>
-        <w:tc>
-          <w:tcPr>
-            <w:tcW w:type="dxa" w:w="1500"/>
-            <w:vAlign w:val="center"/>
-          </w:tcPr>
-          <w:p>
-            <w:pPr>
-              <w:spacing w:before="0" w:after="0"/>
-              <w:jc w:val="center"/>
-            </w:pPr>
-            <w:r/>
-            <w:r>
-              <w:rPr>
-                <w:rFonts w:ascii="Calibri" w:hAnsi="Calibri" w:eastAsia="Arial Unicode MS"/>
-                <w:b w:val="0"/>
-                <w:color w:val="111827"/>
-                <w:sz w:val="16"/>
-              </w:rPr>
-              <w:t>风险 2</w:t>
-            </w:r>
-          </w:p>
-        </w:tc>
-      </w:tr>
-      <w:tr>
-        <w:tc>
-          <w:tcPr>
-            <w:tcW w:type="dxa" w:w="3720"/>
-            <w:vAlign w:val="center"/>
-          </w:tcPr>
-          <w:p>
-            <w:pPr>
-              <w:spacing w:before="0" w:after="0"/>
-            </w:pPr>
-            <w:r/>
-            <w:r>
-              <w:rPr>
-                <w:rFonts w:ascii="Calibri" w:hAnsi="Calibri" w:eastAsia="Arial Unicode MS"/>
-                <w:b w:val="0"/>
-                <w:color w:val="111827"/>
-                <w:sz w:val="17"/>
-              </w:rPr>
-              <w:t>量子硬件供应链与制造规模化能力评估：压力测试 (2026-06-01)</w:t>
-            </w:r>
-          </w:p>
-        </w:tc>
-        <w:tc>
-          <w:tcPr>
-            <w:tcW w:type="dxa" w:w="1560"/>
-            <w:vAlign w:val="center"/>
-          </w:tcPr>
-          <w:p>
-            <w:pPr>
-              <w:spacing w:before="0" w:after="0"/>
-            </w:pPr>
-            <w:r/>
-            <w:r>
-              <w:rPr>
-                <w:rFonts w:ascii="Calibri" w:hAnsi="Calibri" w:eastAsia="Arial Unicode MS"/>
-                <w:b w:val="0"/>
-                <w:color w:val="111827"/>
-                <w:sz w:val="16"/>
-              </w:rPr>
-              <w:t>未识别</w:t>
-            </w:r>
-          </w:p>
-        </w:tc>
-        <w:tc>
-          <w:tcPr>
-            <w:tcW w:type="dxa" w:w="1680"/>
-            <w:vAlign w:val="center"/>
-          </w:tcPr>
-          <w:p>
-            <w:pPr>
-              <w:spacing w:before="0" w:after="0"/>
-            </w:pPr>
-            <w:r/>
-            <w:r>
-              <w:rPr>
-                <w:rFonts w:ascii="Calibri" w:hAnsi="Calibri" w:eastAsia="Arial Unicode MS"/>
-                <w:b w:val="0"/>
-                <w:color w:val="111827"/>
-                <w:sz w:val="16"/>
-              </w:rPr>
-              <w:t>AI 基础设施</w:t>
-            </w:r>
-          </w:p>
-        </w:tc>
-        <w:tc>
-          <w:tcPr>
-            <w:tcW w:type="dxa" w:w="900"/>
-            <w:vAlign w:val="center"/>
-          </w:tcPr>
-          <w:p>
-            <w:pPr>
-              <w:spacing w:before="0" w:after="0"/>
-              <w:jc w:val="center"/>
-            </w:pPr>
-            <w:r/>
-            <w:r>
-              <w:rPr>
-                <w:rFonts w:ascii="Calibri" w:hAnsi="Calibri" w:eastAsia="Arial Unicode MS"/>
-                <w:b/>
-                <w:color w:val="111827"/>
-                <w:sz w:val="17"/>
-              </w:rPr>
-              <w:t>41.3</w:t>
-            </w:r>
-          </w:p>
-        </w:tc>
-        <w:tc>
-          <w:tcPr>
-            <w:tcW w:type="dxa" w:w="1500"/>
-            <w:vAlign w:val="center"/>
-          </w:tcPr>
-          <w:p>
-            <w:pPr>
-              <w:spacing w:before="0" w:after="0"/>
-              <w:jc w:val="center"/>
-            </w:pPr>
-            <w:r/>
-            <w:r>
-              <w:rPr>
-                <w:rFonts w:ascii="Calibri" w:hAnsi="Calibri" w:eastAsia="Arial Unicode MS"/>
-                <w:b w:val="0"/>
-                <w:color w:val="111827"/>
-                <w:sz w:val="16"/>
-              </w:rPr>
-              <w:t>风险 2</w:t>
-            </w:r>
-          </w:p>
-        </w:tc>
-      </w:tr>
-      <w:tr>
-        <w:tc>
-          <w:tcPr>
-            <w:tcW w:type="dxa" w:w="3720"/>
-            <w:vAlign w:val="center"/>
-          </w:tcPr>
-          <w:p>
-            <w:pPr>
-              <w:spacing w:before="0" w:after="0"/>
-            </w:pPr>
-            <w:r/>
-            <w:r>
-              <w:rPr>
-                <w:rFonts w:ascii="Calibri" w:hAnsi="Calibri" w:eastAsia="Arial Unicode MS"/>
-                <w:b w:val="0"/>
-                <w:color w:val="111827"/>
-                <w:sz w:val="17"/>
-              </w:rPr>
-              <w:t>AI 物理墙的跨资产组合与对冲框架</w:t>
-            </w:r>
-          </w:p>
-        </w:tc>
-        <w:tc>
-          <w:tcPr>
-            <w:tcW w:type="dxa" w:w="1560"/>
-            <w:vAlign w:val="center"/>
-          </w:tcPr>
-          <w:p>
-            <w:pPr>
-              <w:spacing w:before="0" w:after="0"/>
-            </w:pPr>
-            <w:r/>
-            <w:r>
-              <w:rPr>
-                <w:rFonts w:ascii="Calibri" w:hAnsi="Calibri" w:eastAsia="Arial Unicode MS"/>
-                <w:b w:val="0"/>
-                <w:color w:val="111827"/>
-                <w:sz w:val="16"/>
-              </w:rPr>
-              <w:t>未识别</w:t>
-            </w:r>
-          </w:p>
-        </w:tc>
-        <w:tc>
-          <w:tcPr>
-            <w:tcW w:type="dxa" w:w="1680"/>
-            <w:vAlign w:val="center"/>
-          </w:tcPr>
-          <w:p>
-            <w:pPr>
-              <w:spacing w:before="0" w:after="0"/>
-            </w:pPr>
-            <w:r/>
-            <w:r>
-              <w:rPr>
-                <w:rFonts w:ascii="Calibri" w:hAnsi="Calibri" w:eastAsia="Arial Unicode MS"/>
-                <w:b w:val="0"/>
-                <w:color w:val="111827"/>
-                <w:sz w:val="16"/>
-              </w:rPr>
-              <w:t>AI 基础设施</w:t>
-            </w:r>
-          </w:p>
-        </w:tc>
-        <w:tc>
-          <w:tcPr>
-            <w:tcW w:type="dxa" w:w="900"/>
-            <w:vAlign w:val="center"/>
-          </w:tcPr>
-          <w:p>
-            <w:pPr>
-              <w:spacing w:before="0" w:after="0"/>
-              <w:jc w:val="center"/>
-            </w:pPr>
-            <w:r/>
-            <w:r>
-              <w:rPr>
-                <w:rFonts w:ascii="Calibri" w:hAnsi="Calibri" w:eastAsia="Arial Unicode MS"/>
-                <w:b/>
-                <w:color w:val="111827"/>
-                <w:sz w:val="17"/>
-              </w:rPr>
-              <w:t>41.3</w:t>
-            </w:r>
-          </w:p>
-        </w:tc>
-        <w:tc>
-          <w:tcPr>
-            <w:tcW w:type="dxa" w:w="1500"/>
-            <w:vAlign w:val="center"/>
-          </w:tcPr>
-          <w:p>
-            <w:pPr>
-              <w:spacing w:before="0" w:after="0"/>
-              <w:jc w:val="center"/>
-            </w:pPr>
-            <w:r/>
-            <w:r>
-              <w:rPr>
-                <w:rFonts w:ascii="Calibri" w:hAnsi="Calibri" w:eastAsia="Arial Unicode MS"/>
-                <w:b w:val="0"/>
-                <w:color w:val="111827"/>
-                <w:sz w:val="16"/>
-              </w:rPr>
-              <w:t>常规</w:t>
-            </w:r>
-          </w:p>
-        </w:tc>
-      </w:tr>
-      <w:tr>
-        <w:tc>
-          <w:tcPr>
-            <w:tcW w:type="dxa" w:w="3720"/>
-            <w:vAlign w:val="center"/>
-          </w:tcPr>
-          <w:p>
-            <w:pPr>
-              <w:spacing w:before="0" w:after="0"/>
-            </w:pPr>
-            <w:r/>
-            <w:r>
-              <w:rPr>
-                <w:rFonts w:ascii="Calibri" w:hAnsi="Calibri" w:eastAsia="Arial Unicode MS"/>
-                <w:b w:val="0"/>
-                <w:color w:val="111827"/>
-                <w:sz w:val="17"/>
-              </w:rPr>
-              <w:t>中国上游原材料成本对中游毛利的挤压及其对零售商的连锁影响</w:t>
-            </w:r>
-          </w:p>
-        </w:tc>
-        <w:tc>
-          <w:tcPr>
-            <w:tcW w:type="dxa" w:w="1560"/>
-            <w:vAlign w:val="center"/>
-          </w:tcPr>
-          <w:p>
-            <w:pPr>
-              <w:spacing w:before="0" w:after="0"/>
-            </w:pPr>
-            <w:r/>
-            <w:r>
-              <w:rPr>
-                <w:rFonts w:ascii="Calibri" w:hAnsi="Calibri" w:eastAsia="Arial Unicode MS"/>
-                <w:b w:val="0"/>
-                <w:color w:val="111827"/>
-                <w:sz w:val="16"/>
-              </w:rPr>
-              <w:t>未识别</w:t>
-            </w:r>
-          </w:p>
-        </w:tc>
-        <w:tc>
-          <w:tcPr>
-            <w:tcW w:type="dxa" w:w="1680"/>
-            <w:vAlign w:val="center"/>
-          </w:tcPr>
-          <w:p>
-            <w:pPr>
-              <w:spacing w:before="0" w:after="0"/>
-            </w:pPr>
-            <w:r/>
-            <w:r>
-              <w:rPr>
-                <w:rFonts w:ascii="Calibri" w:hAnsi="Calibri" w:eastAsia="Arial Unicode MS"/>
-                <w:b w:val="0"/>
-                <w:color w:val="111827"/>
-                <w:sz w:val="16"/>
-              </w:rPr>
-              <w:t>宏观通胀传导</w:t>
-            </w:r>
-          </w:p>
-        </w:tc>
-        <w:tc>
-          <w:tcPr>
-            <w:tcW w:type="dxa" w:w="900"/>
-            <w:vAlign w:val="center"/>
-          </w:tcPr>
-          <w:p>
-            <w:pPr>
-              <w:spacing w:before="0" w:after="0"/>
-              <w:jc w:val="center"/>
-            </w:pPr>
-            <w:r/>
-            <w:r>
-              <w:rPr>
-                <w:rFonts w:ascii="Calibri" w:hAnsi="Calibri" w:eastAsia="Arial Unicode MS"/>
-                <w:b/>
-                <w:color w:val="111827"/>
-                <w:sz w:val="17"/>
-              </w:rPr>
-              <w:t>41.2</w:t>
-            </w:r>
-          </w:p>
-        </w:tc>
-        <w:tc>
-          <w:tcPr>
-            <w:tcW w:type="dxa" w:w="1500"/>
-            <w:vAlign w:val="center"/>
-          </w:tcPr>
-          <w:p>
-            <w:pPr>
-              <w:spacing w:before="0" w:after="0"/>
-              <w:jc w:val="center"/>
-            </w:pPr>
-            <w:r/>
-            <w:r>
-              <w:rPr>
-                <w:rFonts w:ascii="Calibri" w:hAnsi="Calibri" w:eastAsia="Arial Unicode MS"/>
+                <w:rFonts w:ascii="Calibri" w:hAnsi="Calibri" w:eastAsia="Songti SC"/>
                 <w:b w:val="0"/>
                 <w:color w:val="111827"/>
                 <w:sz w:val="16"/>
@@ -3382,7 +3382,7 @@
       </w:pPr>
       <w:r>
         <w:rPr>
-          <w:rFonts w:ascii="Calibri" w:hAnsi="Calibri" w:eastAsia="Arial Unicode MS"/>
+          <w:rFonts w:ascii="Calibri" w:hAnsi="Calibri" w:eastAsia="Songti SC"/>
           <w:b w:val="0"/>
           <w:i/>
           <w:color w:val="667085"/>
@@ -3412,7 +3412,7 @@
     </w:pPr>
     <w:r>
       <w:rPr>
-        <w:rFonts w:ascii="Calibri" w:hAnsi="Calibri" w:eastAsia="Arial Unicode MS"/>
+        <w:rFonts w:ascii="Calibri" w:hAnsi="Calibri" w:eastAsia="Songti SC"/>
         <w:color w:val="667085"/>
         <w:sz w:val="17"/>
       </w:rPr>
@@ -3431,7 +3431,7 @@
     <w:r/>
     <w:r>
       <w:rPr>
-        <w:rFonts w:ascii="Calibri" w:hAnsi="Calibri" w:eastAsia="Arial Unicode MS"/>
+        <w:rFonts w:ascii="Calibri" w:hAnsi="Calibri" w:eastAsia="Songti SC"/>
         <w:color w:val="667085"/>
         <w:sz w:val="18"/>
       </w:rPr>
@@ -3808,7 +3808,7 @@
       <w:spacing w:after="120" w:line="264" w:lineRule="auto"/>
     </w:pPr>
     <w:rPr>
-      <w:rFonts w:ascii="Calibri" w:hAnsi="Calibri" w:eastAsia="Arial Unicode MS"/>
+      <w:rFonts w:ascii="Calibri" w:hAnsi="Calibri" w:eastAsia="Songti SC"/>
       <w:b w:val="0"/>
       <w:color w:val="111827"/>
       <w:sz w:val="22"/>
@@ -3873,7 +3873,7 @@
       <w:outlineLvl w:val="0"/>
     </w:pPr>
     <w:rPr>
-      <w:rFonts w:asciiTheme="majorHAnsi" w:eastAsiaTheme="majorEastAsia" w:hAnsiTheme="majorHAnsi" w:cstheme="majorBidi" w:ascii="Calibri" w:hAnsi="Calibri" w:eastAsia="Arial Unicode MS"/>
+      <w:rFonts w:asciiTheme="majorHAnsi" w:eastAsiaTheme="majorEastAsia" w:hAnsiTheme="majorHAnsi" w:cstheme="majorBidi" w:ascii="Calibri" w:hAnsi="Calibri" w:eastAsia="Songti SC"/>
       <w:b/>
       <w:bCs/>
       <w:color w:val="2E74B5"/>
@@ -3897,7 +3897,7 @@
       <w:outlineLvl w:val="1"/>
     </w:pPr>
     <w:rPr>
-      <w:rFonts w:asciiTheme="majorHAnsi" w:eastAsiaTheme="majorEastAsia" w:hAnsiTheme="majorHAnsi" w:cstheme="majorBidi" w:ascii="Calibri" w:hAnsi="Calibri" w:eastAsia="Arial Unicode MS"/>
+      <w:rFonts w:asciiTheme="majorHAnsi" w:eastAsiaTheme="majorEastAsia" w:hAnsiTheme="majorHAnsi" w:cstheme="majorBidi" w:ascii="Calibri" w:hAnsi="Calibri" w:eastAsia="Songti SC"/>
       <w:b/>
       <w:bCs/>
       <w:color w:val="2E74B5"/>
@@ -3921,7 +3921,7 @@
       <w:outlineLvl w:val="2"/>
     </w:pPr>
     <w:rPr>
-      <w:rFonts w:asciiTheme="majorHAnsi" w:eastAsiaTheme="majorEastAsia" w:hAnsiTheme="majorHAnsi" w:cstheme="majorBidi" w:ascii="Calibri" w:hAnsi="Calibri" w:eastAsia="Arial Unicode MS"/>
+      <w:rFonts w:asciiTheme="majorHAnsi" w:eastAsiaTheme="majorEastAsia" w:hAnsiTheme="majorHAnsi" w:cstheme="majorBidi" w:ascii="Calibri" w:hAnsi="Calibri" w:eastAsia="Songti SC"/>
       <w:b/>
       <w:bCs/>
       <w:color w:val="1F4D78"/>
@@ -4163,7 +4163,7 @@
       <w:contextualSpacing/>
     </w:pPr>
     <w:rPr>
-      <w:rFonts w:asciiTheme="majorHAnsi" w:eastAsiaTheme="majorEastAsia" w:hAnsiTheme="majorHAnsi" w:cstheme="majorBidi" w:ascii="Calibri" w:hAnsi="Calibri" w:eastAsia="Arial Unicode MS"/>
+      <w:rFonts w:asciiTheme="majorHAnsi" w:eastAsiaTheme="majorEastAsia" w:hAnsiTheme="majorHAnsi" w:cstheme="majorBidi" w:ascii="Calibri" w:hAnsi="Calibri" w:eastAsia="Songti SC"/>
       <w:b/>
       <w:color w:val="0B2545"/>
       <w:spacing w:val="5"/>
@@ -4201,7 +4201,7 @@
       </w:numPr>
     </w:pPr>
     <w:rPr>
-      <w:rFonts w:asciiTheme="majorHAnsi" w:eastAsiaTheme="majorEastAsia" w:hAnsiTheme="majorHAnsi" w:cstheme="majorBidi" w:ascii="Calibri" w:hAnsi="Calibri" w:eastAsia="Arial Unicode MS"/>
+      <w:rFonts w:asciiTheme="majorHAnsi" w:eastAsiaTheme="majorEastAsia" w:hAnsiTheme="majorHAnsi" w:cstheme="majorBidi" w:ascii="Calibri" w:hAnsi="Calibri" w:eastAsia="Songti SC"/>
       <w:b w:val="0"/>
       <w:i/>
       <w:iCs/>

</xml_diff>